<commit_message>
feat: add job_name and village_name fields to user registration and profile management
</commit_message>
<xml_diff>
--- a/servers/apps/surveyact/templates/bast-spk/template-bast.docx
+++ b/servers/apps/surveyact/templates/bast-spk/template-bast.docx
@@ -1,6 +1,6 @@
 
 <file path=word/document.xml><?xml version="1.0" encoding="utf-8"?>
-<w:document xmlns:wpc="http://schemas.microsoft.com/office/word/2010/wordprocessingCanvas" xmlns:cx="http://schemas.microsoft.com/office/drawing/2014/chartex" xmlns:cx1="http://schemas.microsoft.com/office/drawing/2015/9/8/chartex" xmlns:cx2="http://schemas.microsoft.com/office/drawing/2015/10/21/chartex" xmlns:cx3="http://schemas.microsoft.com/office/drawing/2016/5/9/chartex" xmlns:cx4="http://schemas.microsoft.com/office/drawing/2016/5/10/chartex" xmlns:cx5="http://schemas.microsoft.com/office/drawing/2016/5/11/chartex" xmlns:cx6="http://schemas.microsoft.com/office/drawing/2016/5/12/chartex" xmlns:cx7="http://schemas.microsoft.com/office/drawing/2016/5/13/chartex" xmlns:cx8="http://schemas.microsoft.com/office/drawing/2016/5/14/chartex" xmlns:mc="http://schemas.openxmlformats.org/markup-compatibility/2006" xmlns:aink="http://schemas.microsoft.com/office/drawing/2016/ink" xmlns:am3d="http://schemas.microsoft.com/office/drawing/2017/model3d" xmlns:o="urn:schemas-microsoft-com:office:office" xmlns:oel="http://schemas.microsoft.com/office/2019/extlst" xmlns:r="http://schemas.openxmlformats.org/officeDocument/2006/relationships" xmlns:m="http://schemas.openxmlformats.org/officeDocument/2006/math" xmlns:v="urn:schemas-microsoft-com:vml" xmlns:wp14="http://schemas.microsoft.com/office/word/2010/wordprocessingDrawing" xmlns:wp="http://schemas.openxmlformats.org/drawingml/2006/wordprocessingDrawing" xmlns:w10="urn:schemas-microsoft-com:office:word" xmlns:w="http://schemas.openxmlformats.org/wordprocessingml/2006/main" xmlns:w14="http://schemas.microsoft.com/office/word/2010/wordml" xmlns:w15="http://schemas.microsoft.com/office/word/2012/wordml" xmlns:w16cex="http://schemas.microsoft.com/office/word/2018/wordml/cex" xmlns:w16cid="http://schemas.microsoft.com/office/word/2016/wordml/cid" xmlns:w16="http://schemas.microsoft.com/office/word/2018/wordml" xmlns:w16du="http://schemas.microsoft.com/office/word/2023/wordml/word16du" xmlns:w16sdtdh="http://schemas.microsoft.com/office/word/2020/wordml/sdtdatahash" xmlns:w16sdtfl="http://schemas.microsoft.com/office/word/2024/wordml/sdtformatlock" xmlns:w16se="http://schemas.microsoft.com/office/word/2015/wordml/symex" xmlns:wpg="http://schemas.microsoft.com/office/word/2010/wordprocessingGroup" xmlns:wpi="http://schemas.microsoft.com/office/word/2010/wordprocessingInk" xmlns:wne="http://schemas.microsoft.com/office/word/2006/wordml" xmlns:wps="http://schemas.microsoft.com/office/word/2010/wordprocessingShape" mc:Ignorable="w14 w15 w16se w16cid w16 w16cex w16sdtdh w16sdtfl w16du wp14">
+<w:document xmlns:wpc="http://schemas.microsoft.com/office/word/2010/wordprocessingCanvas" xmlns:cx="http://schemas.microsoft.com/office/drawing/2014/chartex" xmlns:cx1="http://schemas.microsoft.com/office/drawing/2015/9/8/chartex" xmlns:cx2="http://schemas.microsoft.com/office/drawing/2015/10/21/chartex" xmlns:cx3="http://schemas.microsoft.com/office/drawing/2016/5/9/chartex" xmlns:cx4="http://schemas.microsoft.com/office/drawing/2016/5/10/chartex" xmlns:cx5="http://schemas.microsoft.com/office/drawing/2016/5/11/chartex" xmlns:cx6="http://schemas.microsoft.com/office/drawing/2016/5/12/chartex" xmlns:cx7="http://schemas.microsoft.com/office/drawing/2016/5/13/chartex" xmlns:cx8="http://schemas.microsoft.com/office/drawing/2016/5/14/chartex" xmlns:mc="http://schemas.openxmlformats.org/markup-compatibility/2006" xmlns:aink="http://schemas.microsoft.com/office/drawing/2016/ink" xmlns:am3d="http://schemas.microsoft.com/office/drawing/2017/model3d" xmlns:o="urn:schemas-microsoft-com:office:office" xmlns:r="http://schemas.openxmlformats.org/officeDocument/2006/relationships" xmlns:m="http://schemas.openxmlformats.org/officeDocument/2006/math" xmlns:v="urn:schemas-microsoft-com:vml" xmlns:wp14="http://schemas.microsoft.com/office/word/2010/wordprocessingDrawing" xmlns:wp="http://schemas.openxmlformats.org/drawingml/2006/wordprocessingDrawing" xmlns:w10="urn:schemas-microsoft-com:office:word" xmlns:w="http://schemas.openxmlformats.org/wordprocessingml/2006/main" xmlns:w14="http://schemas.microsoft.com/office/word/2010/wordml" xmlns:w15="http://schemas.microsoft.com/office/word/2012/wordml" xmlns:w16cex="http://schemas.microsoft.com/office/word/2018/wordml/cex" xmlns:w16cid="http://schemas.microsoft.com/office/word/2016/wordml/cid" xmlns:w16="http://schemas.microsoft.com/office/word/2018/wordml" xmlns:w16sdtdh="http://schemas.microsoft.com/office/word/2020/wordml/sdtdatahash" xmlns:w16se="http://schemas.microsoft.com/office/word/2015/wordml/symex" xmlns:wpg="http://schemas.microsoft.com/office/word/2010/wordprocessingGroup" xmlns:wpi="http://schemas.microsoft.com/office/word/2010/wordprocessingInk" xmlns:wne="http://schemas.microsoft.com/office/word/2006/wordml" xmlns:wps="http://schemas.microsoft.com/office/word/2010/wordprocessingShape" mc:Ignorable="w14 w15 w16se w16cid w16 w16cex w16sdtdh wp14">
   <w:body>
     <w:p>
       <w:pPr>
@@ -12,6 +12,7 @@
         <w:spacing w:before="1"/>
         <w:ind w:left="54"/>
         <w:rPr>
+          <w:rFonts w:asciiTheme="minorHAnsi" w:hAnsiTheme="minorHAnsi" w:cstheme="minorHAnsi"/>
           <w:lang w:val="en-US"/>
         </w:rPr>
       </w:pPr>
@@ -26,20 +27,16 @@
         <w:spacing w:before="1"/>
         <w:ind w:left="54"/>
         <w:rPr>
+          <w:rFonts w:asciiTheme="minorHAnsi" w:hAnsiTheme="minorHAnsi" w:cstheme="minorHAnsi"/>
           <w:lang w:val="en-US"/>
         </w:rPr>
       </w:pPr>
       <w:r>
         <w:rPr>
+          <w:rFonts w:asciiTheme="minorHAnsi" w:hAnsiTheme="minorHAnsi" w:cstheme="minorHAnsi"/>
           <w:lang w:val="en-US"/>
         </w:rPr>
-        <w:t xml:space="preserve">BERITA ACARA SERAH TERIMA </w:t>
-      </w:r>
-      <w:r>
-        <w:rPr>
-          <w:lang w:val="en-US"/>
-        </w:rPr>
-        <w:t>(BAST)</w:t>
+        <w:t>BERITA ACARA SERAH TERIMA (BAST)</w:t>
       </w:r>
     </w:p>
     <w:p>
@@ -52,20 +49,16 @@
         <w:spacing w:before="1"/>
         <w:ind w:left="54"/>
         <w:rPr>
+          <w:rFonts w:asciiTheme="minorHAnsi" w:hAnsiTheme="minorHAnsi" w:cstheme="minorHAnsi"/>
           <w:lang w:val="en-US"/>
         </w:rPr>
       </w:pPr>
       <w:r>
         <w:rPr>
+          <w:rFonts w:asciiTheme="minorHAnsi" w:hAnsiTheme="minorHAnsi" w:cstheme="minorHAnsi"/>
           <w:lang w:val="en-US"/>
         </w:rPr>
-        <w:t>HASIL PEKERJAAN PETUGAS LAPANGAN KEGIATAN SURVEI/SENSUS TAHUN 202</w:t>
-      </w:r>
-      <w:r>
-        <w:rPr>
-          <w:lang w:val="en-US"/>
-        </w:rPr>
-        <w:t>6</w:t>
+        <w:t>HASIL PEKERJAAN PETUGAS LAPANGAN KEGIATAN SURVEI/SENSUS TAHUN 2026</w:t>
       </w:r>
     </w:p>
     <w:p>
@@ -78,20 +71,16 @@
         <w:spacing w:before="1"/>
         <w:ind w:left="54"/>
         <w:rPr>
+          <w:rFonts w:asciiTheme="minorHAnsi" w:hAnsiTheme="minorHAnsi" w:cstheme="minorHAnsi"/>
           <w:lang w:val="en-US"/>
         </w:rPr>
       </w:pPr>
       <w:r>
         <w:rPr>
+          <w:rFonts w:asciiTheme="minorHAnsi" w:hAnsiTheme="minorHAnsi" w:cstheme="minorHAnsi"/>
           <w:lang w:val="en-US"/>
         </w:rPr>
-        <w:t xml:space="preserve">PADA BADAN PUSAT STATISTIK </w:t>
-      </w:r>
-      <w:r>
-        <w:rPr>
-          <w:lang w:val="en-US"/>
-        </w:rPr>
-        <w:t>KABUPATEN MUARA ENIM</w:t>
+        <w:t>PADA BADAN PUSAT STATISTIK KABUPATEN MUARA ENIM</w:t>
       </w:r>
     </w:p>
     <w:p>
@@ -104,22 +93,41 @@
         <w:spacing w:before="1"/>
         <w:ind w:left="54"/>
         <w:rPr>
+          <w:rFonts w:asciiTheme="minorHAnsi" w:hAnsiTheme="minorHAnsi" w:cstheme="minorHAnsi"/>
           <w:color w:val="EE0000"/>
           <w:lang w:val="en-US"/>
         </w:rPr>
       </w:pPr>
       <w:r>
         <w:rPr>
+          <w:rFonts w:asciiTheme="minorHAnsi" w:hAnsiTheme="minorHAnsi" w:cstheme="minorHAnsi"/>
           <w:lang w:val="en-US"/>
         </w:rPr>
         <w:t xml:space="preserve">BULAN </w:t>
       </w:r>
       <w:r>
         <w:rPr>
+          <w:rFonts w:asciiTheme="minorHAnsi" w:hAnsiTheme="minorHAnsi" w:cstheme="minorHAnsi"/>
           <w:color w:val="EE0000"/>
           <w:lang w:val="en-US"/>
         </w:rPr>
-        <w:t>FEBRUARI</w:t>
+        <w:t>{bulan</w:t>
+      </w:r>
+      <w:r>
+        <w:rPr>
+          <w:rFonts w:asciiTheme="minorHAnsi" w:hAnsiTheme="minorHAnsi" w:cstheme="minorHAnsi"/>
+          <w:color w:val="EE0000"/>
+          <w:lang w:val="en-US"/>
+        </w:rPr>
+        <w:t>Caps</w:t>
+      </w:r>
+      <w:r>
+        <w:rPr>
+          <w:rFonts w:asciiTheme="minorHAnsi" w:hAnsiTheme="minorHAnsi" w:cstheme="minorHAnsi"/>
+          <w:color w:val="EE0000"/>
+          <w:lang w:val="en-US"/>
+        </w:rPr>
+        <w:t>}</w:t>
       </w:r>
     </w:p>
     <w:p>
@@ -132,90 +140,22 @@
         <w:spacing w:before="1"/>
         <w:ind w:left="54" w:right="0"/>
         <w:rPr>
+          <w:rFonts w:asciiTheme="minorHAnsi" w:hAnsiTheme="minorHAnsi" w:cstheme="minorHAnsi"/>
           <w:color w:val="FF0000"/>
         </w:rPr>
       </w:pPr>
       <w:r>
+        <w:rPr>
+          <w:rFonts w:asciiTheme="minorHAnsi" w:hAnsiTheme="minorHAnsi" w:cstheme="minorHAnsi"/>
+        </w:rPr>
         <w:t>NOMOR:</w:t>
       </w:r>
       <w:r>
         <w:rPr>
+          <w:rFonts w:asciiTheme="minorHAnsi" w:hAnsiTheme="minorHAnsi" w:cstheme="minorHAnsi"/>
           <w:color w:val="FF0000"/>
-          <w:spacing w:val="2"/>
-        </w:rPr>
-        <w:t xml:space="preserve"> </w:t>
-      </w:r>
-      <w:r>
-        <w:rPr>
-          <w:color w:val="FF0000"/>
-        </w:rPr>
-        <w:t>B</w:t>
-      </w:r>
-      <w:r>
-        <w:rPr>
-          <w:color w:val="FF0000"/>
-        </w:rPr>
-        <w:t xml:space="preserve">-  </w:t>
-      </w:r>
-      <w:r>
-        <w:rPr>
-          <w:color w:val="FF0000"/>
-        </w:rPr>
-        <w:t>..........</w:t>
-      </w:r>
-      <w:r>
-        <w:rPr>
-          <w:color w:val="FF0000"/>
-        </w:rPr>
-        <w:t xml:space="preserve"> </w:t>
-      </w:r>
-      <w:r>
-        <w:rPr>
-          <w:color w:val="FF0000"/>
-        </w:rPr>
-        <w:t>/</w:t>
-      </w:r>
-      <w:r>
-        <w:rPr>
-          <w:color w:val="FF0000"/>
-        </w:rPr>
-        <w:t>BPS</w:t>
-      </w:r>
-      <w:r>
-        <w:rPr>
-          <w:color w:val="FF0000"/>
-        </w:rPr>
-        <w:t>1603</w:t>
-      </w:r>
-      <w:r>
-        <w:rPr>
-          <w:color w:val="FF0000"/>
-        </w:rPr>
-        <w:t>/</w:t>
-      </w:r>
-      <w:r>
-        <w:rPr>
-          <w:color w:val="FF0000"/>
-        </w:rPr>
-        <w:t>BAST/</w:t>
-      </w:r>
-      <w:r>
-        <w:rPr>
-          <w:color w:val="FF0000"/>
-        </w:rPr>
-        <w:t>02</w:t>
-      </w:r>
-      <w:r>
-        <w:rPr>
-          <w:color w:val="FF0000"/>
-        </w:rPr>
-        <w:t>/</w:t>
-      </w:r>
-      <w:r>
-        <w:rPr>
-          <w:color w:val="FF0000"/>
-        </w:rPr>
-        <w:t>2026</w:t>
+        </w:rPr>
+        <w:t>{nomorDokBAST}</w:t>
       </w:r>
     </w:p>
     <w:p>
@@ -223,7 +163,7 @@
         <w:pStyle w:val="BodyText"/>
         <w:spacing w:before="2"/>
         <w:rPr>
-          <w:rFonts w:ascii="Arial"/>
+          <w:rFonts w:asciiTheme="minorHAnsi" w:hAnsiTheme="minorHAnsi" w:cstheme="minorHAnsi"/>
           <w:b/>
         </w:rPr>
       </w:pPr>
@@ -238,42 +178,59 @@
           <w:tab w:val="left" w:pos="5651"/>
         </w:tabs>
         <w:ind w:left="222" w:right="168"/>
-      </w:pPr>
-      <w:r>
+        <w:rPr>
+          <w:rFonts w:asciiTheme="minorHAnsi" w:hAnsiTheme="minorHAnsi" w:cstheme="minorHAnsi"/>
+        </w:rPr>
+      </w:pPr>
+      <w:r>
+        <w:rPr>
+          <w:rFonts w:asciiTheme="minorHAnsi" w:hAnsiTheme="minorHAnsi" w:cstheme="minorHAnsi"/>
+        </w:rPr>
         <w:t>Pada</w:t>
       </w:r>
       <w:r>
         <w:rPr>
+          <w:rFonts w:asciiTheme="minorHAnsi" w:hAnsiTheme="minorHAnsi" w:cstheme="minorHAnsi"/>
           <w:spacing w:val="8"/>
         </w:rPr>
         <w:t xml:space="preserve"> </w:t>
       </w:r>
       <w:r>
+        <w:rPr>
+          <w:rFonts w:asciiTheme="minorHAnsi" w:hAnsiTheme="minorHAnsi" w:cstheme="minorHAnsi"/>
+        </w:rPr>
         <w:t>hari</w:t>
       </w:r>
       <w:r>
         <w:rPr>
+          <w:rFonts w:asciiTheme="minorHAnsi" w:hAnsiTheme="minorHAnsi" w:cstheme="minorHAnsi"/>
           <w:spacing w:val="9"/>
         </w:rPr>
         <w:t xml:space="preserve"> </w:t>
       </w:r>
       <w:r>
+        <w:rPr>
+          <w:rFonts w:asciiTheme="minorHAnsi" w:hAnsiTheme="minorHAnsi" w:cstheme="minorHAnsi"/>
+        </w:rPr>
         <w:t xml:space="preserve">ini </w:t>
       </w:r>
       <w:r>
         <w:rPr>
+          <w:rFonts w:asciiTheme="minorHAnsi" w:hAnsiTheme="minorHAnsi" w:cstheme="minorHAnsi"/>
           <w:color w:val="FF0000"/>
         </w:rPr>
-        <w:t>Selasa</w:t>
-      </w:r>
-      <w:r>
-        <w:rPr>
+        <w:t>{hariDokumen}</w:t>
+      </w:r>
+      <w:r>
+        <w:rPr>
+          <w:rFonts w:asciiTheme="minorHAnsi" w:hAnsiTheme="minorHAnsi" w:cstheme="minorHAnsi"/>
           <w:color w:val="FF0000"/>
         </w:rPr>
         <w:t>,</w:t>
       </w:r>
       <w:r>
         <w:rPr>
+          <w:rFonts w:asciiTheme="minorHAnsi" w:hAnsiTheme="minorHAnsi" w:cstheme="minorHAnsi"/>
           <w:color w:val="FF0000"/>
           <w:spacing w:val="8"/>
         </w:rPr>
@@ -281,24 +238,28 @@
       </w:r>
       <w:r>
         <w:rPr>
+          <w:rFonts w:asciiTheme="minorHAnsi" w:hAnsiTheme="minorHAnsi" w:cstheme="minorHAnsi"/>
           <w:color w:val="FF0000"/>
         </w:rPr>
-        <w:t xml:space="preserve">tanggal </w:t>
-      </w:r>
-      <w:r>
-        <w:rPr>
+        <w:t>tanggal</w:t>
+      </w:r>
+      <w:r>
+        <w:rPr>
+          <w:rFonts w:asciiTheme="minorHAnsi" w:hAnsiTheme="minorHAnsi" w:cstheme="minorHAnsi"/>
           <w:color w:val="FF0000"/>
         </w:rPr>
-        <w:t>Sepuluh</w:t>
-      </w:r>
-      <w:r>
-        <w:rPr>
+        <w:t xml:space="preserve"> {tanggalTerbilang}</w:t>
+      </w:r>
+      <w:r>
+        <w:rPr>
+          <w:rFonts w:asciiTheme="minorHAnsi" w:hAnsiTheme="minorHAnsi" w:cstheme="minorHAnsi"/>
           <w:color w:val="FF0000"/>
         </w:rPr>
         <w:t>,</w:t>
       </w:r>
       <w:r>
         <w:rPr>
+          <w:rFonts w:asciiTheme="minorHAnsi" w:hAnsiTheme="minorHAnsi" w:cstheme="minorHAnsi"/>
           <w:color w:val="FF0000"/>
           <w:spacing w:val="9"/>
         </w:rPr>
@@ -306,24 +267,28 @@
       </w:r>
       <w:r>
         <w:rPr>
+          <w:rFonts w:asciiTheme="minorHAnsi" w:hAnsiTheme="minorHAnsi" w:cstheme="minorHAnsi"/>
           <w:color w:val="FF0000"/>
         </w:rPr>
         <w:t xml:space="preserve">bulan </w:t>
       </w:r>
       <w:r>
         <w:rPr>
+          <w:rFonts w:asciiTheme="minorHAnsi" w:hAnsiTheme="minorHAnsi" w:cstheme="minorHAnsi"/>
           <w:color w:val="FF0000"/>
         </w:rPr>
-        <w:t>Februari</w:t>
-      </w:r>
-      <w:r>
-        <w:rPr>
+        <w:t>{bulan}</w:t>
+      </w:r>
+      <w:r>
+        <w:rPr>
+          <w:rFonts w:asciiTheme="minorHAnsi" w:hAnsiTheme="minorHAnsi" w:cstheme="minorHAnsi"/>
           <w:color w:val="FF0000"/>
         </w:rPr>
         <w:t>,</w:t>
       </w:r>
       <w:r>
         <w:rPr>
+          <w:rFonts w:asciiTheme="minorHAnsi" w:hAnsiTheme="minorHAnsi" w:cstheme="minorHAnsi"/>
           <w:color w:val="FF0000"/>
           <w:spacing w:val="9"/>
         </w:rPr>
@@ -331,12 +296,14 @@
       </w:r>
       <w:r>
         <w:rPr>
+          <w:rFonts w:asciiTheme="minorHAnsi" w:hAnsiTheme="minorHAnsi" w:cstheme="minorHAnsi"/>
           <w:color w:val="FF0000"/>
         </w:rPr>
         <w:t>tahun</w:t>
       </w:r>
       <w:r>
         <w:rPr>
+          <w:rFonts w:asciiTheme="minorHAnsi" w:hAnsiTheme="minorHAnsi" w:cstheme="minorHAnsi"/>
           <w:color w:val="FF0000"/>
           <w:spacing w:val="6"/>
         </w:rPr>
@@ -344,165 +311,130 @@
       </w:r>
       <w:r>
         <w:rPr>
+          <w:rFonts w:asciiTheme="minorHAnsi" w:hAnsiTheme="minorHAnsi" w:cstheme="minorHAnsi"/>
           <w:color w:val="FF0000"/>
         </w:rPr>
-        <w:t>D</w:t>
-      </w:r>
-      <w:r>
-        <w:rPr>
+        <w:t xml:space="preserve">{tahunTerbilang} </w:t>
+      </w:r>
+      <w:r>
+        <w:rPr>
+          <w:rFonts w:asciiTheme="minorHAnsi" w:hAnsiTheme="minorHAnsi" w:cstheme="minorHAnsi"/>
           <w:color w:val="FF0000"/>
         </w:rPr>
-        <w:t>ua</w:t>
-      </w:r>
-      <w:r>
-        <w:rPr>
+        <w:t>(</w:t>
+      </w:r>
+      <w:r>
+        <w:rPr>
+          <w:rFonts w:asciiTheme="minorHAnsi" w:hAnsiTheme="minorHAnsi" w:cstheme="minorHAnsi"/>
           <w:color w:val="FF0000"/>
-          <w:spacing w:val="7"/>
+        </w:rPr>
+        <w:t>{tanggalDokumen}</w:t>
+      </w:r>
+      <w:r>
+        <w:rPr>
+          <w:rFonts w:asciiTheme="minorHAnsi" w:hAnsiTheme="minorHAnsi" w:cstheme="minorHAnsi"/>
+          <w:color w:val="FF0000"/>
+        </w:rPr>
+        <w:t>)</w:t>
+      </w:r>
+      <w:r>
+        <w:rPr>
+          <w:rFonts w:asciiTheme="minorHAnsi" w:hAnsiTheme="minorHAnsi" w:cstheme="minorHAnsi"/>
+        </w:rPr>
+        <w:t>,</w:t>
+      </w:r>
+      <w:r>
+        <w:rPr>
+          <w:rFonts w:asciiTheme="minorHAnsi" w:hAnsiTheme="minorHAnsi" w:cstheme="minorHAnsi"/>
+          <w:spacing w:val="8"/>
         </w:rPr>
         <w:t xml:space="preserve"> </w:t>
       </w:r>
       <w:r>
         <w:rPr>
-          <w:color w:val="FF0000"/>
-        </w:rPr>
-        <w:t>R</w:t>
-      </w:r>
-      <w:r>
-        <w:rPr>
-          <w:color w:val="FF0000"/>
-        </w:rPr>
-        <w:t>ibu</w:t>
-      </w:r>
-      <w:r>
-        <w:rPr>
-          <w:color w:val="FF0000"/>
-          <w:spacing w:val="9"/>
+          <w:rFonts w:asciiTheme="minorHAnsi" w:hAnsiTheme="minorHAnsi" w:cstheme="minorHAnsi"/>
+        </w:rPr>
+        <w:t>kami</w:t>
+      </w:r>
+      <w:r>
+        <w:rPr>
+          <w:rFonts w:asciiTheme="minorHAnsi" w:hAnsiTheme="minorHAnsi" w:cstheme="minorHAnsi"/>
+          <w:spacing w:val="-58"/>
         </w:rPr>
         <w:t xml:space="preserve"> </w:t>
       </w:r>
       <w:r>
         <w:rPr>
-          <w:color w:val="FF0000"/>
-        </w:rPr>
-        <w:t>D</w:t>
-      </w:r>
-      <w:r>
-        <w:rPr>
-          <w:color w:val="FF0000"/>
-        </w:rPr>
-        <w:t>ua</w:t>
-      </w:r>
-      <w:r>
-        <w:rPr>
-          <w:color w:val="FF0000"/>
-          <w:spacing w:val="9"/>
+          <w:rFonts w:asciiTheme="minorHAnsi" w:hAnsiTheme="minorHAnsi" w:cstheme="minorHAnsi"/>
+          <w:spacing w:val="-58"/>
+        </w:rPr>
+        <w:t xml:space="preserve">                     </w:t>
+      </w:r>
+      <w:r>
+        <w:rPr>
+          <w:rFonts w:asciiTheme="minorHAnsi" w:hAnsiTheme="minorHAnsi" w:cstheme="minorHAnsi"/>
+        </w:rPr>
+        <w:t>yang</w:t>
+      </w:r>
+      <w:r>
+        <w:rPr>
+          <w:rFonts w:asciiTheme="minorHAnsi" w:hAnsiTheme="minorHAnsi" w:cstheme="minorHAnsi"/>
+          <w:spacing w:val="2"/>
         </w:rPr>
         <w:t xml:space="preserve"> </w:t>
       </w:r>
       <w:r>
         <w:rPr>
-          <w:color w:val="FF0000"/>
-        </w:rPr>
-        <w:t>P</w:t>
-      </w:r>
-      <w:r>
-        <w:rPr>
-          <w:color w:val="FF0000"/>
-        </w:rPr>
-        <w:t>uluh</w:t>
-      </w:r>
-      <w:r>
-        <w:rPr>
-          <w:color w:val="FF0000"/>
-          <w:spacing w:val="8"/>
+          <w:rFonts w:asciiTheme="minorHAnsi" w:hAnsiTheme="minorHAnsi" w:cstheme="minorHAnsi"/>
+        </w:rPr>
+        <w:t>bertanda</w:t>
+      </w:r>
+      <w:r>
+        <w:rPr>
+          <w:rFonts w:asciiTheme="minorHAnsi" w:hAnsiTheme="minorHAnsi" w:cstheme="minorHAnsi"/>
+          <w:spacing w:val="-2"/>
         </w:rPr>
         <w:t xml:space="preserve"> </w:t>
       </w:r>
       <w:r>
         <w:rPr>
-          <w:color w:val="FF0000"/>
-        </w:rPr>
-        <w:t>Enam (</w:t>
-      </w:r>
-      <w:r>
-        <w:rPr>
-          <w:color w:val="FF0000"/>
-        </w:rPr>
-        <w:t>10</w:t>
-      </w:r>
-      <w:r>
-        <w:rPr>
-          <w:color w:val="FF0000"/>
-        </w:rPr>
-        <w:t>-02-2026)</w:t>
-      </w:r>
-      <w:r>
-        <w:t>,</w:t>
-      </w:r>
-      <w:r>
-        <w:rPr>
-          <w:spacing w:val="8"/>
+          <w:rFonts w:asciiTheme="minorHAnsi" w:hAnsiTheme="minorHAnsi" w:cstheme="minorHAnsi"/>
+        </w:rPr>
+        <w:t>tangan</w:t>
+      </w:r>
+      <w:r>
+        <w:rPr>
+          <w:rFonts w:asciiTheme="minorHAnsi" w:hAnsiTheme="minorHAnsi" w:cstheme="minorHAnsi"/>
+          <w:spacing w:val="-2"/>
         </w:rPr>
         <w:t xml:space="preserve"> </w:t>
       </w:r>
       <w:r>
-        <w:t>kami</w:t>
-      </w:r>
-      <w:r>
-        <w:rPr>
-          <w:spacing w:val="-58"/>
+        <w:rPr>
+          <w:rFonts w:asciiTheme="minorHAnsi" w:hAnsiTheme="minorHAnsi" w:cstheme="minorHAnsi"/>
+        </w:rPr>
+        <w:t>di</w:t>
+      </w:r>
+      <w:r>
+        <w:rPr>
+          <w:rFonts w:asciiTheme="minorHAnsi" w:hAnsiTheme="minorHAnsi" w:cstheme="minorHAnsi"/>
+          <w:spacing w:val="-4"/>
         </w:rPr>
         <w:t xml:space="preserve"> </w:t>
       </w:r>
       <w:r>
         <w:rPr>
-          <w:spacing w:val="-58"/>
-        </w:rPr>
-        <w:t xml:space="preserve">                     </w:t>
-      </w:r>
-      <w:r>
-        <w:t>yang</w:t>
-      </w:r>
-      <w:r>
-        <w:rPr>
-          <w:spacing w:val="2"/>
-        </w:rPr>
-        <w:t xml:space="preserve"> </w:t>
-      </w:r>
-      <w:r>
-        <w:t>bertanda</w:t>
-      </w:r>
-      <w:r>
-        <w:rPr>
-          <w:spacing w:val="-2"/>
-        </w:rPr>
-        <w:t xml:space="preserve"> </w:t>
-      </w:r>
-      <w:r>
-        <w:t>tangan</w:t>
-      </w:r>
-      <w:r>
-        <w:rPr>
-          <w:spacing w:val="-2"/>
-        </w:rPr>
-        <w:t xml:space="preserve"> </w:t>
-      </w:r>
-      <w:r>
-        <w:t>di</w:t>
-      </w:r>
-      <w:r>
-        <w:rPr>
-          <w:spacing w:val="-4"/>
-        </w:rPr>
-        <w:t xml:space="preserve"> </w:t>
-      </w:r>
-      <w:r>
+          <w:rFonts w:asciiTheme="minorHAnsi" w:hAnsiTheme="minorHAnsi" w:cstheme="minorHAnsi"/>
+        </w:rPr>
         <w:t>bawah ini:</w:t>
       </w:r>
     </w:p>
     <w:p>
       <w:pPr>
         <w:pStyle w:val="BodyText"/>
+        <w:rPr>
+          <w:rFonts w:asciiTheme="minorHAnsi" w:hAnsiTheme="minorHAnsi" w:cstheme="minorHAnsi"/>
+        </w:rPr>
       </w:pPr>
     </w:p>
     <w:p>
@@ -521,26 +453,32 @@
         <w:spacing w:line="252" w:lineRule="exact"/>
         <w:ind w:hanging="721"/>
         <w:rPr>
-          <w:rFonts w:ascii="Times New Roman"/>
-        </w:rPr>
-      </w:pPr>
-      <w:r>
+          <w:rFonts w:asciiTheme="minorHAnsi" w:hAnsiTheme="minorHAnsi" w:cstheme="minorHAnsi"/>
+        </w:rPr>
+      </w:pPr>
+      <w:r>
+        <w:rPr>
+          <w:rFonts w:asciiTheme="minorHAnsi" w:hAnsiTheme="minorHAnsi" w:cstheme="minorHAnsi"/>
+        </w:rPr>
         <w:t>Nama</w:t>
       </w:r>
       <w:r>
         <w:rPr>
-          <w:rFonts w:ascii="Times New Roman"/>
+          <w:rFonts w:asciiTheme="minorHAnsi" w:hAnsiTheme="minorHAnsi" w:cstheme="minorHAnsi"/>
         </w:rPr>
         <w:tab/>
       </w:r>
       <w:r>
+        <w:rPr>
+          <w:rFonts w:asciiTheme="minorHAnsi" w:hAnsiTheme="minorHAnsi" w:cstheme="minorHAnsi"/>
+        </w:rPr>
         <w:t xml:space="preserve">:  </w:t>
       </w:r>
       <w:r>
-        <w:t xml:space="preserve">Riska Kuzaimah, </w:t>
-      </w:r>
-      <w:r>
-        <w:t>S.Akt, M.M.</w:t>
+        <w:rPr>
+          <w:rFonts w:asciiTheme="minorHAnsi" w:hAnsiTheme="minorHAnsi" w:cstheme="minorHAnsi"/>
+        </w:rPr>
+        <w:t>{namaPPK}</w:t>
       </w:r>
     </w:p>
     <w:p>
@@ -553,27 +491,33 @@
         <w:spacing w:line="252" w:lineRule="exact"/>
         <w:ind w:left="941"/>
         <w:rPr>
-          <w:rFonts w:ascii="Times New Roman"/>
-        </w:rPr>
-      </w:pPr>
-      <w:r>
+          <w:rFonts w:asciiTheme="minorHAnsi" w:hAnsiTheme="minorHAnsi" w:cstheme="minorHAnsi"/>
+        </w:rPr>
+      </w:pPr>
+      <w:r>
+        <w:rPr>
+          <w:rFonts w:asciiTheme="minorHAnsi" w:hAnsiTheme="minorHAnsi" w:cstheme="minorHAnsi"/>
+        </w:rPr>
         <w:t>NIP.</w:t>
       </w:r>
       <w:r>
         <w:rPr>
-          <w:rFonts w:ascii="Times New Roman"/>
+          <w:rFonts w:asciiTheme="minorHAnsi" w:hAnsiTheme="minorHAnsi" w:cstheme="minorHAnsi"/>
         </w:rPr>
         <w:tab/>
       </w:r>
       <w:r>
+        <w:rPr>
+          <w:rFonts w:asciiTheme="minorHAnsi" w:hAnsiTheme="minorHAnsi" w:cstheme="minorHAnsi"/>
+        </w:rPr>
         <w:t xml:space="preserve">:  </w:t>
       </w:r>
       <w:r>
         <w:rPr>
-          <w:rFonts w:ascii="Arial" w:hAnsi="Arial" w:cs="Arial"/>
+          <w:rFonts w:asciiTheme="minorHAnsi" w:hAnsiTheme="minorHAnsi" w:cstheme="minorHAnsi"/>
           <w:color w:val="000000" w:themeColor="text1"/>
         </w:rPr>
-        <w:t>198604092009022002</w:t>
+        <w:t>{nipPPK}</w:t>
       </w:r>
     </w:p>
     <w:p>
@@ -586,36 +530,48 @@
         <w:spacing w:before="1"/>
         <w:ind w:left="941" w:right="165"/>
         <w:rPr>
+          <w:rFonts w:asciiTheme="minorHAnsi" w:hAnsiTheme="minorHAnsi" w:cstheme="minorHAnsi"/>
           <w:spacing w:val="33"/>
         </w:rPr>
       </w:pPr>
       <w:r>
+        <w:rPr>
+          <w:rFonts w:asciiTheme="minorHAnsi" w:hAnsiTheme="minorHAnsi" w:cstheme="minorHAnsi"/>
+        </w:rPr>
         <w:t>Jabatan</w:t>
       </w:r>
       <w:r>
         <w:rPr>
-          <w:rFonts w:ascii="Times New Roman"/>
+          <w:rFonts w:asciiTheme="minorHAnsi" w:hAnsiTheme="minorHAnsi" w:cstheme="minorHAnsi"/>
         </w:rPr>
         <w:tab/>
-      </w:r>
-      <w:r>
         <w:t xml:space="preserve">:  </w:t>
       </w:r>
       <w:r>
+        <w:rPr>
+          <w:rFonts w:asciiTheme="minorHAnsi" w:hAnsiTheme="minorHAnsi" w:cstheme="minorHAnsi"/>
+        </w:rPr>
         <w:t>Pejabat Pembuat Komitmen</w:t>
       </w:r>
       <w:r>
         <w:rPr>
+          <w:rFonts w:asciiTheme="minorHAnsi" w:hAnsiTheme="minorHAnsi" w:cstheme="minorHAnsi"/>
           <w:spacing w:val="35"/>
         </w:rPr>
         <w:t xml:space="preserve"> </w:t>
       </w:r>
       <w:bookmarkStart w:id="0" w:name="_Hlk119638895"/>
       <w:r>
+        <w:rPr>
+          <w:rFonts w:asciiTheme="minorHAnsi" w:hAnsiTheme="minorHAnsi" w:cstheme="minorHAnsi"/>
+        </w:rPr>
         <w:t>BPS Kabupaten Muara Enim</w:t>
       </w:r>
       <w:bookmarkEnd w:id="0"/>
       <w:r>
+        <w:rPr>
+          <w:rFonts w:asciiTheme="minorHAnsi" w:hAnsiTheme="minorHAnsi" w:cstheme="minorHAnsi"/>
+        </w:rPr>
         <w:t>,</w:t>
       </w:r>
     </w:p>
@@ -628,51 +584,82 @@
         </w:tabs>
         <w:spacing w:before="1"/>
         <w:ind w:right="165"/>
-      </w:pPr>
-      <w:r>
+        <w:rPr>
+          <w:rFonts w:asciiTheme="minorHAnsi" w:hAnsiTheme="minorHAnsi" w:cstheme="minorHAnsi"/>
+        </w:rPr>
+      </w:pPr>
+      <w:r>
+        <w:rPr>
+          <w:rFonts w:asciiTheme="minorHAnsi" w:hAnsiTheme="minorHAnsi" w:cstheme="minorHAnsi"/>
+        </w:rPr>
         <w:tab/>
         <w:t xml:space="preserve">   </w:t>
       </w:r>
       <w:r>
+        <w:rPr>
+          <w:rFonts w:asciiTheme="minorHAnsi" w:hAnsiTheme="minorHAnsi" w:cstheme="minorHAnsi"/>
+        </w:rPr>
         <w:t>selanjutnya</w:t>
       </w:r>
       <w:r>
         <w:rPr>
+          <w:rFonts w:asciiTheme="minorHAnsi" w:hAnsiTheme="minorHAnsi" w:cstheme="minorHAnsi"/>
           <w:spacing w:val="32"/>
         </w:rPr>
         <w:t xml:space="preserve"> </w:t>
       </w:r>
       <w:r>
+        <w:rPr>
+          <w:rFonts w:asciiTheme="minorHAnsi" w:hAnsiTheme="minorHAnsi" w:cstheme="minorHAnsi"/>
+        </w:rPr>
         <w:t>disebut</w:t>
       </w:r>
       <w:r>
         <w:rPr>
+          <w:rFonts w:asciiTheme="minorHAnsi" w:hAnsiTheme="minorHAnsi" w:cstheme="minorHAnsi"/>
           <w:spacing w:val="33"/>
         </w:rPr>
         <w:t xml:space="preserve"> </w:t>
       </w:r>
       <w:r>
+        <w:rPr>
+          <w:rFonts w:asciiTheme="minorHAnsi" w:hAnsiTheme="minorHAnsi" w:cstheme="minorHAnsi"/>
+        </w:rPr>
         <w:t>PIHAK</w:t>
       </w:r>
       <w:r>
         <w:rPr>
+          <w:rFonts w:asciiTheme="minorHAnsi" w:hAnsiTheme="minorHAnsi" w:cstheme="minorHAnsi"/>
+        </w:rPr>
+        <w:t xml:space="preserve"> </w:t>
+      </w:r>
+      <w:r>
+        <w:rPr>
+          <w:rFonts w:asciiTheme="minorHAnsi" w:hAnsiTheme="minorHAnsi" w:cstheme="minorHAnsi"/>
           <w:spacing w:val="-58"/>
         </w:rPr>
         <w:t xml:space="preserve"> </w:t>
       </w:r>
       <w:r>
         <w:rPr>
+          <w:rFonts w:asciiTheme="minorHAnsi" w:hAnsiTheme="minorHAnsi" w:cstheme="minorHAnsi"/>
           <w:spacing w:val="-58"/>
         </w:rPr>
         <w:t xml:space="preserve">                 </w:t>
       </w:r>
       <w:r>
+        <w:rPr>
+          <w:rFonts w:asciiTheme="minorHAnsi" w:hAnsiTheme="minorHAnsi" w:cstheme="minorHAnsi"/>
+        </w:rPr>
         <w:t>PERTAMA</w:t>
       </w:r>
     </w:p>
     <w:p>
       <w:pPr>
         <w:pStyle w:val="BodyText"/>
+        <w:rPr>
+          <w:rFonts w:asciiTheme="minorHAnsi" w:hAnsiTheme="minorHAnsi" w:cstheme="minorHAnsi"/>
+        </w:rPr>
       </w:pPr>
     </w:p>
     <w:p>
@@ -690,37 +677,56 @@
         </w:tabs>
         <w:ind w:left="941" w:right="20"/>
         <w:rPr>
-          <w:rFonts w:ascii="Times New Roman"/>
-        </w:rPr>
-      </w:pPr>
-      <w:r>
+          <w:rFonts w:asciiTheme="minorHAnsi" w:hAnsiTheme="minorHAnsi" w:cstheme="minorHAnsi"/>
+        </w:rPr>
+      </w:pPr>
+      <w:r>
+        <w:rPr>
+          <w:rFonts w:asciiTheme="minorHAnsi" w:hAnsiTheme="minorHAnsi" w:cstheme="minorHAnsi"/>
+        </w:rPr>
         <w:t>Nama</w:t>
       </w:r>
       <w:r>
         <w:rPr>
-          <w:rFonts w:ascii="Times New Roman"/>
+          <w:rFonts w:asciiTheme="minorHAnsi" w:hAnsiTheme="minorHAnsi" w:cstheme="minorHAnsi"/>
         </w:rPr>
         <w:tab/>
       </w:r>
       <w:r>
+        <w:rPr>
+          <w:rFonts w:asciiTheme="minorHAnsi" w:hAnsiTheme="minorHAnsi" w:cstheme="minorHAnsi"/>
+        </w:rPr>
         <w:t xml:space="preserve">:   </w:t>
       </w:r>
       <w:r>
         <w:rPr>
+          <w:rFonts w:asciiTheme="minorHAnsi" w:hAnsiTheme="minorHAnsi" w:cstheme="minorHAnsi"/>
           <w:color w:val="EE0000"/>
         </w:rPr>
-        <w:t>......................................</w:t>
-      </w:r>
-      <w:r>
+        <w:t>{namaPetugas}</w:t>
+      </w:r>
+      <w:r>
+        <w:rPr>
+          <w:rFonts w:asciiTheme="minorHAnsi" w:hAnsiTheme="minorHAnsi" w:cstheme="minorHAnsi"/>
+        </w:rPr>
         <w:fldChar w:fldCharType="begin"/>
       </w:r>
       <w:r>
+        <w:rPr>
+          <w:rFonts w:asciiTheme="minorHAnsi" w:hAnsiTheme="minorHAnsi" w:cstheme="minorHAnsi"/>
+        </w:rPr>
         <w:instrText xml:space="preserve"> MERGEFIELD Nama_Koseka </w:instrText>
       </w:r>
       <w:r>
+        <w:rPr>
+          <w:rFonts w:asciiTheme="minorHAnsi" w:hAnsiTheme="minorHAnsi" w:cstheme="minorHAnsi"/>
+        </w:rPr>
         <w:fldChar w:fldCharType="separate"/>
       </w:r>
       <w:r>
+        <w:rPr>
+          <w:rFonts w:asciiTheme="minorHAnsi" w:hAnsiTheme="minorHAnsi" w:cstheme="minorHAnsi"/>
+        </w:rPr>
         <w:fldChar w:fldCharType="end"/>
       </w:r>
     </w:p>
@@ -735,44 +741,75 @@
         </w:tabs>
         <w:ind w:right="20" w:firstLine="0"/>
         <w:rPr>
-          <w:rFonts w:ascii="Times New Roman"/>
-        </w:rPr>
-      </w:pPr>
-      <w:r>
+          <w:rFonts w:asciiTheme="minorHAnsi" w:hAnsiTheme="minorHAnsi" w:cstheme="minorHAnsi"/>
+        </w:rPr>
+      </w:pPr>
+      <w:r>
+        <w:rPr>
+          <w:rFonts w:asciiTheme="minorHAnsi" w:hAnsiTheme="minorHAnsi" w:cstheme="minorHAnsi"/>
+        </w:rPr>
         <w:fldChar w:fldCharType="begin"/>
       </w:r>
       <w:r>
+        <w:rPr>
+          <w:rFonts w:asciiTheme="minorHAnsi" w:hAnsiTheme="minorHAnsi" w:cstheme="minorHAnsi"/>
+        </w:rPr>
         <w:instrText xml:space="preserve"> MERGEFIELD NIPNIK </w:instrText>
       </w:r>
       <w:r>
+        <w:rPr>
+          <w:rFonts w:asciiTheme="minorHAnsi" w:hAnsiTheme="minorHAnsi" w:cstheme="minorHAnsi"/>
+        </w:rPr>
         <w:fldChar w:fldCharType="separate"/>
       </w:r>
       <w:r>
         <w:rPr>
+          <w:rFonts w:asciiTheme="minorHAnsi" w:hAnsiTheme="minorHAnsi" w:cstheme="minorHAnsi"/>
           <w:noProof/>
         </w:rPr>
         <w:t>NIP</w:t>
       </w:r>
       <w:r>
+        <w:rPr>
+          <w:rFonts w:asciiTheme="minorHAnsi" w:hAnsiTheme="minorHAnsi" w:cstheme="minorHAnsi"/>
+        </w:rPr>
         <w:fldChar w:fldCharType="end"/>
       </w:r>
       <w:r>
+        <w:rPr>
+          <w:rFonts w:asciiTheme="minorHAnsi" w:hAnsiTheme="minorHAnsi" w:cstheme="minorHAnsi"/>
+        </w:rPr>
         <w:tab/>
         <w:t xml:space="preserve">:   </w:t>
       </w:r>
       <w:r>
+        <w:rPr>
+          <w:rFonts w:asciiTheme="minorHAnsi" w:hAnsiTheme="minorHAnsi" w:cstheme="minorHAnsi"/>
+        </w:rPr>
         <w:t>-</w:t>
       </w:r>
       <w:r>
+        <w:rPr>
+          <w:rFonts w:asciiTheme="minorHAnsi" w:hAnsiTheme="minorHAnsi" w:cstheme="minorHAnsi"/>
+        </w:rPr>
         <w:fldChar w:fldCharType="begin"/>
       </w:r>
       <w:r>
+        <w:rPr>
+          <w:rFonts w:asciiTheme="minorHAnsi" w:hAnsiTheme="minorHAnsi" w:cstheme="minorHAnsi"/>
+        </w:rPr>
         <w:instrText xml:space="preserve"> MERGEFIELD NIKNIP_Koseka </w:instrText>
       </w:r>
       <w:r>
+        <w:rPr>
+          <w:rFonts w:asciiTheme="minorHAnsi" w:hAnsiTheme="minorHAnsi" w:cstheme="minorHAnsi"/>
+        </w:rPr>
         <w:fldChar w:fldCharType="separate"/>
       </w:r>
       <w:r>
+        <w:rPr>
+          <w:rFonts w:asciiTheme="minorHAnsi" w:hAnsiTheme="minorHAnsi" w:cstheme="minorHAnsi"/>
+        </w:rPr>
         <w:fldChar w:fldCharType="end"/>
       </w:r>
     </w:p>
@@ -786,41 +823,47 @@
         <w:spacing w:before="1"/>
         <w:ind w:left="941" w:right="166"/>
         <w:rPr>
+          <w:rFonts w:asciiTheme="minorHAnsi" w:hAnsiTheme="minorHAnsi" w:cstheme="minorHAnsi"/>
           <w:spacing w:val="24"/>
         </w:rPr>
       </w:pPr>
       <w:r>
+        <w:rPr>
+          <w:rFonts w:asciiTheme="minorHAnsi" w:hAnsiTheme="minorHAnsi" w:cstheme="minorHAnsi"/>
+        </w:rPr>
         <w:t>Jabatan</w:t>
       </w:r>
       <w:r>
         <w:rPr>
-          <w:rFonts w:ascii="Times New Roman"/>
+          <w:rFonts w:asciiTheme="minorHAnsi" w:hAnsiTheme="minorHAnsi" w:cstheme="minorHAnsi"/>
         </w:rPr>
         <w:tab/>
-      </w:r>
-      <w:r>
         <w:t>:</w:t>
       </w:r>
       <w:r>
         <w:rPr>
+          <w:rFonts w:asciiTheme="minorHAnsi" w:hAnsiTheme="minorHAnsi" w:cstheme="minorHAnsi"/>
           <w:spacing w:val="112"/>
         </w:rPr>
         <w:t xml:space="preserve"> </w:t>
       </w:r>
       <w:r>
         <w:rPr>
+          <w:rFonts w:asciiTheme="minorHAnsi" w:hAnsiTheme="minorHAnsi" w:cstheme="minorHAnsi"/>
           <w:color w:val="EE0000"/>
         </w:rPr>
         <w:t xml:space="preserve">Petugas </w:t>
       </w:r>
       <w:r>
         <w:rPr>
+          <w:rFonts w:asciiTheme="minorHAnsi" w:hAnsiTheme="minorHAnsi" w:cstheme="minorHAnsi"/>
           <w:color w:val="EE0000"/>
         </w:rPr>
         <w:t>Lapangan Survei/Sensus Kabupaten Muara Enim</w:t>
       </w:r>
       <w:r>
         <w:rPr>
+          <w:rFonts w:asciiTheme="minorHAnsi" w:hAnsiTheme="minorHAnsi" w:cstheme="minorHAnsi"/>
           <w:spacing w:val="24"/>
         </w:rPr>
         <w:t xml:space="preserve"> </w:t>
@@ -836,50 +879,74 @@
         <w:spacing w:before="1"/>
         <w:ind w:left="941" w:right="166"/>
         <w:rPr>
+          <w:rFonts w:asciiTheme="minorHAnsi" w:hAnsiTheme="minorHAnsi" w:cstheme="minorHAnsi"/>
           <w:spacing w:val="24"/>
         </w:rPr>
       </w:pPr>
       <w:r>
         <w:rPr>
+          <w:rFonts w:asciiTheme="minorHAnsi" w:hAnsiTheme="minorHAnsi" w:cstheme="minorHAnsi"/>
           <w:spacing w:val="24"/>
         </w:rPr>
         <w:tab/>
         <w:t xml:space="preserve">   </w:t>
       </w:r>
       <w:r>
+        <w:rPr>
+          <w:rFonts w:asciiTheme="minorHAnsi" w:hAnsiTheme="minorHAnsi" w:cstheme="minorHAnsi"/>
+        </w:rPr>
         <w:t>selanjutnya</w:t>
       </w:r>
       <w:r>
         <w:rPr>
+          <w:rFonts w:asciiTheme="minorHAnsi" w:hAnsiTheme="minorHAnsi" w:cstheme="minorHAnsi"/>
           <w:spacing w:val="24"/>
         </w:rPr>
         <w:t xml:space="preserve"> </w:t>
       </w:r>
       <w:r>
+        <w:rPr>
+          <w:rFonts w:asciiTheme="minorHAnsi" w:hAnsiTheme="minorHAnsi" w:cstheme="minorHAnsi"/>
+        </w:rPr>
         <w:t>disebut</w:t>
       </w:r>
       <w:r>
         <w:rPr>
+          <w:rFonts w:asciiTheme="minorHAnsi" w:hAnsiTheme="minorHAnsi" w:cstheme="minorHAnsi"/>
           <w:spacing w:val="24"/>
         </w:rPr>
         <w:t xml:space="preserve"> </w:t>
       </w:r>
       <w:r>
+        <w:rPr>
+          <w:rFonts w:asciiTheme="minorHAnsi" w:hAnsiTheme="minorHAnsi" w:cstheme="minorHAnsi"/>
+        </w:rPr>
         <w:t>PIHAK</w:t>
       </w:r>
       <w:r>
         <w:rPr>
+          <w:rFonts w:asciiTheme="minorHAnsi" w:hAnsiTheme="minorHAnsi" w:cstheme="minorHAnsi"/>
+        </w:rPr>
+        <w:t xml:space="preserve"> </w:t>
+      </w:r>
+      <w:r>
+        <w:rPr>
+          <w:rFonts w:asciiTheme="minorHAnsi" w:hAnsiTheme="minorHAnsi" w:cstheme="minorHAnsi"/>
           <w:spacing w:val="-58"/>
         </w:rPr>
         <w:t xml:space="preserve"> </w:t>
       </w:r>
       <w:r>
         <w:rPr>
+          <w:rFonts w:asciiTheme="minorHAnsi" w:hAnsiTheme="minorHAnsi" w:cstheme="minorHAnsi"/>
           <w:spacing w:val="-58"/>
         </w:rPr>
         <w:t xml:space="preserve">                     </w:t>
       </w:r>
       <w:r>
+        <w:rPr>
+          <w:rFonts w:asciiTheme="minorHAnsi" w:hAnsiTheme="minorHAnsi" w:cstheme="minorHAnsi"/>
+        </w:rPr>
         <w:t>KEDUA</w:t>
       </w:r>
     </w:p>
@@ -887,6 +954,7 @@
       <w:pPr>
         <w:pStyle w:val="BodyText"/>
         <w:rPr>
+          <w:rFonts w:asciiTheme="minorHAnsi" w:hAnsiTheme="minorHAnsi" w:cstheme="minorHAnsi"/>
           <w:sz w:val="24"/>
         </w:rPr>
       </w:pPr>
@@ -895,11 +963,13 @@
       <w:pPr>
         <w:pStyle w:val="BodyText"/>
         <w:rPr>
+          <w:rFonts w:asciiTheme="minorHAnsi" w:hAnsiTheme="minorHAnsi" w:cstheme="minorHAnsi"/>
           <w:lang w:val="en-US"/>
         </w:rPr>
       </w:pPr>
       <w:r>
         <w:rPr>
+          <w:rFonts w:asciiTheme="minorHAnsi" w:hAnsiTheme="minorHAnsi" w:cstheme="minorHAnsi"/>
           <w:lang w:val="en-US"/>
         </w:rPr>
         <w:t xml:space="preserve">Dengan ini menyatakan:  </w:t>
@@ -914,108 +984,42 @@
         </w:numPr>
         <w:jc w:val="both"/>
         <w:rPr>
+          <w:rFonts w:asciiTheme="minorHAnsi" w:hAnsiTheme="minorHAnsi" w:cstheme="minorHAnsi"/>
           <w:lang w:val="en-US"/>
         </w:rPr>
       </w:pPr>
       <w:r>
         <w:rPr>
+          <w:rFonts w:asciiTheme="minorHAnsi" w:hAnsiTheme="minorHAnsi" w:cstheme="minorHAnsi"/>
           <w:lang w:val="en-US"/>
         </w:rPr>
-        <w:t>PIHAK KEDUA telah melaksanakan pekerjaan Lapangan Survei/Sensus Tahun 202</w:t>
-      </w:r>
-      <w:r>
-        <w:rPr>
-          <w:lang w:val="en-US"/>
-        </w:rPr>
-        <w:t>6</w:t>
-      </w:r>
-      <w:r>
-        <w:rPr>
-          <w:lang w:val="en-US"/>
-        </w:rPr>
-        <w:t xml:space="preserve"> bulan </w:t>
-      </w:r>
-      <w:r>
-        <w:rPr>
+        <w:t xml:space="preserve">PIHAK KEDUA telah melaksanakan pekerjaan Lapangan Survei/Sensus Tahun 2026 bulan </w:t>
+      </w:r>
+      <w:r>
+        <w:rPr>
+          <w:rFonts w:asciiTheme="minorHAnsi" w:hAnsiTheme="minorHAnsi" w:cstheme="minorHAnsi"/>
           <w:color w:val="EE0000"/>
           <w:lang w:val="en-US"/>
         </w:rPr>
-        <w:t>Februari</w:t>
-      </w:r>
-      <w:r>
-        <w:rPr>
+        <w:t>{bulan}</w:t>
+      </w:r>
+      <w:r>
+        <w:rPr>
+          <w:rFonts w:asciiTheme="minorHAnsi" w:hAnsiTheme="minorHAnsi" w:cstheme="minorHAnsi"/>
           <w:lang w:val="en-US"/>
         </w:rPr>
-        <w:t xml:space="preserve"> berdasarkan </w:t>
-      </w:r>
-      <w:r>
-        <w:rPr>
-          <w:lang w:val="en-US"/>
-        </w:rPr>
-        <w:t xml:space="preserve">Surat </w:t>
-      </w:r>
-      <w:r>
-        <w:rPr>
-          <w:lang w:val="en-US"/>
-        </w:rPr>
-        <w:t>Perjanjian Kerja Petugas Lapangan</w:t>
-      </w:r>
-      <w:r>
-        <w:rPr>
-          <w:lang w:val="en-US"/>
-        </w:rPr>
-        <w:t xml:space="preserve"> Kegiatan </w:t>
-      </w:r>
-      <w:r>
-        <w:rPr>
-          <w:lang w:val="en-US"/>
-        </w:rPr>
-        <w:t xml:space="preserve">Survei/Sensus </w:t>
-      </w:r>
-      <w:r>
-        <w:rPr>
-          <w:lang w:val="en-US"/>
-        </w:rPr>
-        <w:t xml:space="preserve">Bulanan </w:t>
-      </w:r>
-      <w:r>
-        <w:rPr>
-          <w:lang w:val="en-US"/>
-        </w:rPr>
-        <w:t>Tahun 202</w:t>
-      </w:r>
-      <w:r>
-        <w:rPr>
-          <w:lang w:val="en-US"/>
-        </w:rPr>
-        <w:t>6</w:t>
-      </w:r>
-      <w:r>
-        <w:rPr>
-          <w:lang w:val="en-US"/>
-        </w:rPr>
-        <w:t xml:space="preserve"> pada Badan Pusat Statistik </w:t>
-      </w:r>
-      <w:r>
-        <w:rPr>
-          <w:lang w:val="en-US"/>
-        </w:rPr>
-        <w:t xml:space="preserve">Kabupaten Muara Enim </w:t>
-      </w:r>
-      <w:r>
-        <w:rPr>
-          <w:lang w:val="en-US"/>
-        </w:rPr>
-        <w:t xml:space="preserve">Nomor: </w:t>
-      </w:r>
-      <w:r>
-        <w:rPr>
+        <w:t xml:space="preserve"> berdasarkan Surat Perjanjian Kerja Petugas Lapangan Kegiatan Survei/Sensus Bulanan Tahun 2026 pada Badan Pusat Statistik Kabupaten Muara Enim Nomor: </w:t>
+      </w:r>
+      <w:r>
+        <w:rPr>
+          <w:rFonts w:asciiTheme="minorHAnsi" w:hAnsiTheme="minorHAnsi" w:cstheme="minorHAnsi"/>
           <w:color w:val="EE0000"/>
         </w:rPr>
-        <w:t>……………/BPS1603/PPK/SPK/02/2026</w:t>
-      </w:r>
-      <w:r>
-        <w:rPr>
+        <w:t>{nomorSPK}</w:t>
+      </w:r>
+      <w:r>
+        <w:rPr>
+          <w:rFonts w:asciiTheme="minorHAnsi" w:hAnsiTheme="minorHAnsi" w:cstheme="minorHAnsi"/>
           <w:lang w:val="en-US"/>
         </w:rPr>
         <w:t>.</w:t>
@@ -1030,39 +1034,32 @@
         </w:numPr>
         <w:jc w:val="both"/>
         <w:rPr>
+          <w:rFonts w:asciiTheme="minorHAnsi" w:hAnsiTheme="minorHAnsi" w:cstheme="minorHAnsi"/>
           <w:lang w:val="en-US"/>
         </w:rPr>
       </w:pPr>
       <w:r>
         <w:rPr>
+          <w:rFonts w:asciiTheme="minorHAnsi" w:hAnsiTheme="minorHAnsi" w:cstheme="minorHAnsi"/>
           <w:lang w:val="en-US"/>
         </w:rPr>
-        <w:t>PIHAK KEDUA telah menyelesaikan pekerjaan Lapangan Survei/Sensus Tahun 202</w:t>
-      </w:r>
-      <w:r>
-        <w:rPr>
-          <w:lang w:val="en-US"/>
-        </w:rPr>
-        <w:t>6</w:t>
-      </w:r>
-      <w:r>
-        <w:rPr>
-          <w:lang w:val="en-US"/>
-        </w:rPr>
-        <w:t xml:space="preserve"> berdasarkan </w:t>
+        <w:t xml:space="preserve">PIHAK KEDUA telah menyelesaikan pekerjaan Lapangan Survei/Sensus Tahun 2026 berdasarkan </w:t>
       </w:r>
       <w:sdt>
         <w:sdtPr>
           <w:rPr>
+            <w:rFonts w:asciiTheme="minorHAnsi" w:hAnsiTheme="minorHAnsi" w:cstheme="minorHAnsi"/>
             <w:lang w:val="en-US"/>
           </w:rPr>
           <w:tag w:val="goog_rdk_0"/>
           <w:id w:val="1518354234"/>
         </w:sdtPr>
+        <w:sdtEndPr/>
         <w:sdtContent/>
       </w:sdt>
       <w:r>
         <w:rPr>
+          <w:rFonts w:asciiTheme="minorHAnsi" w:hAnsiTheme="minorHAnsi" w:cstheme="minorHAnsi"/>
           <w:lang w:val="en-US"/>
         </w:rPr>
         <w:t xml:space="preserve">hasil pemeriksaan dan evaluasi pekerjaan sebagaimana tercantum dalam lampiran. </w:t>
@@ -1077,26 +1074,16 @@
         </w:numPr>
         <w:jc w:val="both"/>
         <w:rPr>
+          <w:rFonts w:asciiTheme="minorHAnsi" w:hAnsiTheme="minorHAnsi" w:cstheme="minorHAnsi"/>
           <w:lang w:val="en-US"/>
         </w:rPr>
       </w:pPr>
       <w:r>
         <w:rPr>
+          <w:rFonts w:asciiTheme="minorHAnsi" w:hAnsiTheme="minorHAnsi" w:cstheme="minorHAnsi"/>
           <w:lang w:val="en-US"/>
         </w:rPr>
-        <w:t>Berdasarkan angka 2 tersebut di atas, PIHAK KEDUA menyerahkan hasil pekerjaan Lapangan Survei/Sensus Tahun 202</w:t>
-      </w:r>
-      <w:r>
-        <w:rPr>
-          <w:lang w:val="en-US"/>
-        </w:rPr>
-        <w:t>6</w:t>
-      </w:r>
-      <w:r>
-        <w:rPr>
-          <w:lang w:val="en-US"/>
-        </w:rPr>
-        <w:t xml:space="preserve"> kepada PIHAK PERTAMA, dan PIHAK PERTAMA menerima hasil pekerjaan tersebut sesuai target dan beban kerja dalam lampiran.</w:t>
+        <w:t>Berdasarkan angka 2 tersebut di atas, PIHAK KEDUA menyerahkan hasil pekerjaan Lapangan Survei/Sensus Tahun 2026 kepada PIHAK PERTAMA, dan PIHAK PERTAMA menerima hasil pekerjaan tersebut sesuai target dan beban kerja dalam lampiran.</w:t>
       </w:r>
     </w:p>
     <w:p>
@@ -1108,11 +1095,13 @@
         </w:numPr>
         <w:jc w:val="both"/>
         <w:rPr>
+          <w:rFonts w:asciiTheme="minorHAnsi" w:hAnsiTheme="minorHAnsi" w:cstheme="minorHAnsi"/>
           <w:lang w:val="en-US"/>
         </w:rPr>
       </w:pPr>
       <w:r>
         <w:rPr>
+          <w:rFonts w:asciiTheme="minorHAnsi" w:hAnsiTheme="minorHAnsi" w:cstheme="minorHAnsi"/>
           <w:lang w:val="en-US"/>
         </w:rPr>
         <w:t>Untuk hasil pendataan lengkap sebagaimana dimaksud pada angka 3 yang memerlukan pemeriksaan lanjutan, akan dilakukan pengecekan, perubahan, dan/atau kunjungan kembali ke lapangan merujuk pada perjanjian yang ditandatangani oleh PARA PIHAK.</w:t>
@@ -1122,6 +1111,7 @@
       <w:pPr>
         <w:pStyle w:val="BodyText"/>
         <w:rPr>
+          <w:rFonts w:asciiTheme="minorHAnsi" w:hAnsiTheme="minorHAnsi" w:cstheme="minorHAnsi"/>
           <w:lang w:val="en-US"/>
         </w:rPr>
       </w:pPr>
@@ -1130,11 +1120,13 @@
       <w:pPr>
         <w:pStyle w:val="BodyText"/>
         <w:rPr>
+          <w:rFonts w:asciiTheme="minorHAnsi" w:hAnsiTheme="minorHAnsi" w:cstheme="minorHAnsi"/>
           <w:lang w:val="en-US"/>
         </w:rPr>
       </w:pPr>
       <w:r>
         <w:rPr>
+          <w:rFonts w:asciiTheme="minorHAnsi" w:hAnsiTheme="minorHAnsi" w:cstheme="minorHAnsi"/>
           <w:lang w:val="en-US"/>
         </w:rPr>
         <w:t>Demikian Berita Acara ini dibuat dengan sebenarnya dalam rangkap 2 (dua) dan menjadi sah berlaku setelah ditandatangani oleh KEDUA BELAH PIHAK.</w:t>
@@ -1144,6 +1136,7 @@
       <w:pPr>
         <w:pStyle w:val="BodyText"/>
         <w:rPr>
+          <w:rFonts w:asciiTheme="minorHAnsi" w:hAnsiTheme="minorHAnsi" w:cstheme="minorHAnsi"/>
           <w:sz w:val="20"/>
         </w:rPr>
       </w:pPr>
@@ -1151,6 +1144,7 @@
     <w:p>
       <w:pPr>
         <w:rPr>
+          <w:rFonts w:asciiTheme="minorHAnsi" w:hAnsiTheme="minorHAnsi" w:cstheme="minorHAnsi"/>
           <w:sz w:val="20"/>
         </w:rPr>
         <w:sectPr>
@@ -1171,6 +1165,9 @@
         </w:tabs>
         <w:spacing w:line="249" w:lineRule="exact"/>
         <w:ind w:left="538"/>
+        <w:rPr>
+          <w:rFonts w:asciiTheme="minorHAnsi" w:hAnsiTheme="minorHAnsi" w:cstheme="minorHAnsi"/>
+        </w:rPr>
       </w:pPr>
     </w:p>
     <w:p>
@@ -1181,6 +1178,9 @@
         </w:tabs>
         <w:spacing w:line="249" w:lineRule="exact"/>
         <w:ind w:left="538"/>
+        <w:rPr>
+          <w:rFonts w:asciiTheme="minorHAnsi" w:hAnsiTheme="minorHAnsi" w:cstheme="minorHAnsi"/>
+        </w:rPr>
       </w:pPr>
     </w:p>
     <w:tbl>
@@ -1199,8 +1199,8 @@
         <w:tblLook w:val="04A0" w:firstRow="1" w:lastRow="0" w:firstColumn="1" w:lastColumn="0" w:noHBand="0" w:noVBand="1"/>
       </w:tblPr>
       <w:tblGrid>
-        <w:gridCol w:w="4726"/>
-        <w:gridCol w:w="4738"/>
+        <w:gridCol w:w="4714"/>
+        <w:gridCol w:w="4750"/>
       </w:tblGrid>
       <w:tr>
         <w:tc>
@@ -1213,21 +1213,34 @@
               <w:spacing w:before="93" w:line="252" w:lineRule="exact"/>
               <w:ind w:left="-311" w:right="26"/>
               <w:jc w:val="center"/>
+              <w:rPr>
+                <w:rFonts w:asciiTheme="minorHAnsi" w:hAnsiTheme="minorHAnsi" w:cstheme="minorHAnsi"/>
+              </w:rPr>
             </w:pPr>
             <w:r>
+              <w:rPr>
+                <w:rFonts w:asciiTheme="minorHAnsi" w:hAnsiTheme="minorHAnsi" w:cstheme="minorHAnsi"/>
+              </w:rPr>
               <w:t xml:space="preserve">    </w:t>
             </w:r>
             <w:bookmarkStart w:id="1" w:name="_Hlk119659914"/>
             <w:r>
+              <w:rPr>
+                <w:rFonts w:asciiTheme="minorHAnsi" w:hAnsiTheme="minorHAnsi" w:cstheme="minorHAnsi"/>
+              </w:rPr>
               <w:t>PIHAK</w:t>
             </w:r>
             <w:r>
               <w:rPr>
+                <w:rFonts w:asciiTheme="minorHAnsi" w:hAnsiTheme="minorHAnsi" w:cstheme="minorHAnsi"/>
                 <w:spacing w:val="-3"/>
               </w:rPr>
               <w:t xml:space="preserve"> </w:t>
             </w:r>
             <w:r>
+              <w:rPr>
+                <w:rFonts w:asciiTheme="minorHAnsi" w:hAnsiTheme="minorHAnsi" w:cstheme="minorHAnsi"/>
+              </w:rPr>
               <w:t>KEDUA</w:t>
             </w:r>
           </w:p>
@@ -1237,31 +1250,30 @@
               <w:spacing w:before="10"/>
               <w:jc w:val="center"/>
               <w:rPr>
-                <w:rFonts w:ascii="Arial" w:hAnsi="Arial" w:cs="Arial"/>
+                <w:rFonts w:asciiTheme="minorHAnsi" w:hAnsiTheme="minorHAnsi" w:cstheme="minorHAnsi"/>
                 <w:color w:val="EE0000"/>
                 <w:shd w:val="clear" w:color="auto" w:fill="FFFFFF"/>
               </w:rPr>
             </w:pPr>
             <w:r>
               <w:rPr>
+                <w:rFonts w:asciiTheme="minorHAnsi" w:hAnsiTheme="minorHAnsi" w:cstheme="minorHAnsi"/>
                 <w:color w:val="EE0000"/>
               </w:rPr>
-              <w:t xml:space="preserve">Petugas </w:t>
-            </w:r>
-            <w:r>
-              <w:rPr>
-                <w:color w:val="EE0000"/>
-              </w:rPr>
-              <w:t>Lapangan Survei/Sensus</w:t>
+              <w:t>Petugas Lapangan Survei/Sensus</w:t>
             </w:r>
           </w:p>
           <w:p>
             <w:pPr>
               <w:pStyle w:val="BodyText"/>
               <w:jc w:val="center"/>
+              <w:rPr>
+                <w:rFonts w:asciiTheme="minorHAnsi" w:hAnsiTheme="minorHAnsi" w:cstheme="minorHAnsi"/>
+              </w:rPr>
             </w:pPr>
             <w:r>
               <w:rPr>
+                <w:rFonts w:asciiTheme="minorHAnsi" w:hAnsiTheme="minorHAnsi" w:cstheme="minorHAnsi"/>
                 <w:color w:val="EE0000"/>
               </w:rPr>
               <w:t>Kabupaten Muara Enim</w:t>
@@ -1271,6 +1283,9 @@
             <w:pPr>
               <w:pStyle w:val="BodyText"/>
               <w:jc w:val="center"/>
+              <w:rPr>
+                <w:rFonts w:asciiTheme="minorHAnsi" w:hAnsiTheme="minorHAnsi" w:cstheme="minorHAnsi"/>
+              </w:rPr>
             </w:pPr>
           </w:p>
           <w:p>
@@ -1278,19 +1293,25 @@
               <w:pStyle w:val="BodyText"/>
               <w:jc w:val="center"/>
               <w:rPr>
-                <w:rFonts w:ascii="Arial" w:hAnsi="Arial" w:cs="Arial"/>
+                <w:rFonts w:asciiTheme="minorHAnsi" w:hAnsiTheme="minorHAnsi" w:cstheme="minorHAnsi"/>
               </w:rPr>
             </w:pPr>
           </w:p>
           <w:p>
             <w:pPr>
               <w:pStyle w:val="BodyText"/>
+              <w:rPr>
+                <w:rFonts w:asciiTheme="minorHAnsi" w:hAnsiTheme="minorHAnsi" w:cstheme="minorHAnsi"/>
+              </w:rPr>
             </w:pPr>
           </w:p>
           <w:p>
             <w:pPr>
               <w:pStyle w:val="BodyText"/>
               <w:jc w:val="center"/>
+              <w:rPr>
+                <w:rFonts w:asciiTheme="minorHAnsi" w:hAnsiTheme="minorHAnsi" w:cstheme="minorHAnsi"/>
+              </w:rPr>
             </w:pPr>
           </w:p>
         </w:tc>
@@ -1303,17 +1324,27 @@
               <w:pStyle w:val="BodyText"/>
               <w:ind w:left="625" w:right="744"/>
               <w:jc w:val="center"/>
+              <w:rPr>
+                <w:rFonts w:asciiTheme="minorHAnsi" w:hAnsiTheme="minorHAnsi" w:cstheme="minorHAnsi"/>
+              </w:rPr>
             </w:pPr>
             <w:r>
+              <w:rPr>
+                <w:rFonts w:asciiTheme="minorHAnsi" w:hAnsiTheme="minorHAnsi" w:cstheme="minorHAnsi"/>
+              </w:rPr>
               <w:t>PIHAK</w:t>
             </w:r>
             <w:r>
               <w:rPr>
+                <w:rFonts w:asciiTheme="minorHAnsi" w:hAnsiTheme="minorHAnsi" w:cstheme="minorHAnsi"/>
                 <w:spacing w:val="-6"/>
               </w:rPr>
               <w:t xml:space="preserve"> </w:t>
             </w:r>
             <w:r>
+              <w:rPr>
+                <w:rFonts w:asciiTheme="minorHAnsi" w:hAnsiTheme="minorHAnsi" w:cstheme="minorHAnsi"/>
+              </w:rPr>
               <w:t>PERTAMA</w:t>
             </w:r>
           </w:p>
@@ -1322,8 +1353,14 @@
               <w:pStyle w:val="BodyText"/>
               <w:ind w:left="-95"/>
               <w:jc w:val="center"/>
+              <w:rPr>
+                <w:rFonts w:asciiTheme="minorHAnsi" w:hAnsiTheme="minorHAnsi" w:cstheme="minorHAnsi"/>
+              </w:rPr>
             </w:pPr>
             <w:r>
+              <w:rPr>
+                <w:rFonts w:asciiTheme="minorHAnsi" w:hAnsiTheme="minorHAnsi" w:cstheme="minorHAnsi"/>
+              </w:rPr>
               <w:t>Pejabat Pembuat Komitmen</w:t>
             </w:r>
           </w:p>
@@ -1332,25 +1369,61 @@
               <w:pStyle w:val="BodyText"/>
               <w:ind w:left="-95"/>
               <w:jc w:val="center"/>
+              <w:rPr>
+                <w:rFonts w:asciiTheme="minorHAnsi" w:hAnsiTheme="minorHAnsi" w:cstheme="minorHAnsi"/>
+              </w:rPr>
             </w:pPr>
             <w:r>
+              <w:rPr>
+                <w:rFonts w:asciiTheme="minorHAnsi" w:hAnsiTheme="minorHAnsi" w:cstheme="minorHAnsi"/>
+              </w:rPr>
               <w:t xml:space="preserve">BPS </w:t>
             </w:r>
             <w:bookmarkStart w:id="2" w:name="_Hlk119671420"/>
             <w:r>
+              <w:rPr>
+                <w:rFonts w:asciiTheme="minorHAnsi" w:hAnsiTheme="minorHAnsi" w:cstheme="minorHAnsi"/>
+              </w:rPr>
               <w:t>Kabupaten Muara Enim</w:t>
             </w:r>
             <w:bookmarkEnd w:id="2"/>
           </w:p>
-          <w:p/>
-          <w:p/>
-          <w:p/>
-          <w:p/>
+          <w:p>
+            <w:pPr>
+              <w:rPr>
+                <w:rFonts w:asciiTheme="minorHAnsi" w:hAnsiTheme="minorHAnsi" w:cstheme="minorHAnsi"/>
+              </w:rPr>
+            </w:pPr>
+          </w:p>
+          <w:p>
+            <w:pPr>
+              <w:rPr>
+                <w:rFonts w:asciiTheme="minorHAnsi" w:hAnsiTheme="minorHAnsi" w:cstheme="minorHAnsi"/>
+              </w:rPr>
+            </w:pPr>
+          </w:p>
+          <w:p>
+            <w:pPr>
+              <w:rPr>
+                <w:rFonts w:asciiTheme="minorHAnsi" w:hAnsiTheme="minorHAnsi" w:cstheme="minorHAnsi"/>
+              </w:rPr>
+            </w:pPr>
+          </w:p>
+          <w:p>
+            <w:pPr>
+              <w:rPr>
+                <w:rFonts w:asciiTheme="minorHAnsi" w:hAnsiTheme="minorHAnsi" w:cstheme="minorHAnsi"/>
+              </w:rPr>
+            </w:pPr>
+          </w:p>
           <w:p>
             <w:pPr>
               <w:tabs>
                 <w:tab w:val="left" w:pos="1271"/>
               </w:tabs>
+              <w:rPr>
+                <w:rFonts w:asciiTheme="minorHAnsi" w:hAnsiTheme="minorHAnsi" w:cstheme="minorHAnsi"/>
+              </w:rPr>
             </w:pPr>
           </w:p>
         </w:tc>
@@ -1365,16 +1438,18 @@
               <w:pStyle w:val="BodyText"/>
               <w:jc w:val="center"/>
               <w:rPr>
+                <w:rFonts w:asciiTheme="minorHAnsi" w:hAnsiTheme="minorHAnsi" w:cstheme="minorHAnsi"/>
                 <w:color w:val="EE0000"/>
                 <w:u w:val="single"/>
               </w:rPr>
             </w:pPr>
             <w:r>
               <w:rPr>
+                <w:rFonts w:asciiTheme="minorHAnsi" w:hAnsiTheme="minorHAnsi" w:cstheme="minorHAnsi"/>
                 <w:color w:val="EE0000"/>
                 <w:u w:val="single"/>
               </w:rPr>
-              <w:t>.........................................</w:t>
+              <w:t>{namaPetugas}</w:t>
             </w:r>
           </w:p>
         </w:tc>
@@ -1388,21 +1463,17 @@
               <w:spacing w:before="5"/>
               <w:jc w:val="center"/>
               <w:rPr>
+                <w:rFonts w:asciiTheme="minorHAnsi" w:hAnsiTheme="minorHAnsi" w:cstheme="minorHAnsi"/>
                 <w:u w:val="single"/>
               </w:rPr>
             </w:pPr>
             <w:bookmarkStart w:id="3" w:name="_Hlk119671440"/>
             <w:r>
               <w:rPr>
+                <w:rFonts w:asciiTheme="minorHAnsi" w:hAnsiTheme="minorHAnsi" w:cstheme="minorHAnsi"/>
                 <w:u w:val="single"/>
               </w:rPr>
-              <w:t>Riska Kuzaimah, S</w:t>
-            </w:r>
-            <w:r>
-              <w:rPr>
-                <w:u w:val="single"/>
-              </w:rPr>
-              <w:t>.Akt, M.M.</w:t>
+              <w:t>{namaPPK}</w:t>
             </w:r>
           </w:p>
           <w:p>
@@ -1413,13 +1484,19 @@
               </w:tabs>
               <w:spacing w:line="249" w:lineRule="exact"/>
               <w:ind w:left="538"/>
+              <w:rPr>
+                <w:rFonts w:asciiTheme="minorHAnsi" w:hAnsiTheme="minorHAnsi" w:cstheme="minorHAnsi"/>
+              </w:rPr>
             </w:pPr>
             <w:r>
+              <w:rPr>
+                <w:rFonts w:asciiTheme="minorHAnsi" w:hAnsiTheme="minorHAnsi" w:cstheme="minorHAnsi"/>
+              </w:rPr>
               <w:t xml:space="preserve">      NIP.</w:t>
             </w:r>
             <w:r>
               <w:rPr>
-                <w:rFonts w:ascii="Bookman Old Style" w:hAnsi="Bookman Old Style" w:cs="Arial"/>
+                <w:rFonts w:asciiTheme="minorHAnsi" w:hAnsiTheme="minorHAnsi" w:cstheme="minorHAnsi"/>
                 <w:color w:val="000000" w:themeColor="text1"/>
                 <w:sz w:val="24"/>
                 <w:szCs w:val="24"/>
@@ -1428,10 +1505,10 @@
             </w:r>
             <w:r>
               <w:rPr>
-                <w:rFonts w:ascii="Arial" w:hAnsi="Arial" w:cs="Arial"/>
+                <w:rFonts w:asciiTheme="minorHAnsi" w:hAnsiTheme="minorHAnsi" w:cstheme="minorHAnsi"/>
                 <w:color w:val="000000" w:themeColor="text1"/>
               </w:rPr>
-              <w:t>198604092009022002</w:t>
+              <w:t>{nipPPK}</w:t>
             </w:r>
           </w:p>
           <w:bookmarkEnd w:id="3"/>
@@ -1440,6 +1517,9 @@
               <w:pStyle w:val="BodyText"/>
               <w:ind w:left="625" w:right="744"/>
               <w:jc w:val="center"/>
+              <w:rPr>
+                <w:rFonts w:asciiTheme="minorHAnsi" w:hAnsiTheme="minorHAnsi" w:cstheme="minorHAnsi"/>
+              </w:rPr>
             </w:pPr>
           </w:p>
         </w:tc>
@@ -1451,14 +1531,989 @@
         <w:tabs>
           <w:tab w:val="left" w:pos="5244"/>
         </w:tabs>
+        <w:rPr>
+          <w:rFonts w:asciiTheme="minorHAnsi" w:hAnsiTheme="minorHAnsi" w:cstheme="minorHAnsi"/>
+        </w:rPr>
+      </w:pPr>
+    </w:p>
+    <w:p>
+      <w:pPr>
+        <w:tabs>
+          <w:tab w:val="left" w:pos="5244"/>
+        </w:tabs>
+        <w:rPr>
+          <w:rFonts w:asciiTheme="minorHAnsi" w:hAnsiTheme="minorHAnsi" w:cstheme="minorHAnsi"/>
+        </w:rPr>
+      </w:pPr>
+    </w:p>
+    <w:p>
+      <w:pPr>
+        <w:tabs>
+          <w:tab w:val="left" w:pos="5244"/>
+        </w:tabs>
+        <w:rPr>
+          <w:rFonts w:asciiTheme="minorHAnsi" w:hAnsiTheme="minorHAnsi" w:cstheme="minorHAnsi"/>
+        </w:rPr>
+      </w:pPr>
+    </w:p>
+    <w:p>
+      <w:pPr>
+        <w:tabs>
+          <w:tab w:val="left" w:pos="5244"/>
+        </w:tabs>
+        <w:rPr>
+          <w:rFonts w:asciiTheme="minorHAnsi" w:hAnsiTheme="minorHAnsi" w:cstheme="minorHAnsi"/>
+        </w:rPr>
+      </w:pPr>
+    </w:p>
+    <w:p>
+      <w:pPr>
+        <w:tabs>
+          <w:tab w:val="left" w:pos="5244"/>
+        </w:tabs>
+        <w:rPr>
+          <w:rFonts w:asciiTheme="minorHAnsi" w:hAnsiTheme="minorHAnsi" w:cstheme="minorHAnsi"/>
+        </w:rPr>
+      </w:pPr>
+    </w:p>
+    <w:p>
+      <w:pPr>
+        <w:tabs>
+          <w:tab w:val="left" w:pos="5244"/>
+        </w:tabs>
+        <w:rPr>
+          <w:rFonts w:asciiTheme="minorHAnsi" w:hAnsiTheme="minorHAnsi" w:cstheme="minorHAnsi"/>
+        </w:rPr>
+      </w:pPr>
+    </w:p>
+    <w:p>
+      <w:pPr>
+        <w:tabs>
+          <w:tab w:val="left" w:pos="5244"/>
+        </w:tabs>
+        <w:rPr>
+          <w:rFonts w:asciiTheme="minorHAnsi" w:hAnsiTheme="minorHAnsi" w:cstheme="minorHAnsi"/>
+        </w:rPr>
+      </w:pPr>
+    </w:p>
+    <w:p>
+      <w:pPr>
+        <w:tabs>
+          <w:tab w:val="left" w:pos="5244"/>
+        </w:tabs>
+        <w:rPr>
+          <w:rFonts w:asciiTheme="minorHAnsi" w:hAnsiTheme="minorHAnsi" w:cstheme="minorHAnsi"/>
+        </w:rPr>
+        <w:sectPr>
+          <w:headerReference w:type="default" r:id="rId10"/>
+          <w:footerReference w:type="default" r:id="rId11"/>
+          <w:type w:val="continuous"/>
+          <w:pgSz w:w="11910" w:h="16840"/>
+          <w:pgMar w:top="620" w:right="960" w:bottom="820" w:left="1480" w:header="720" w:footer="720" w:gutter="0"/>
+          <w:cols w:space="720"/>
+        </w:sectPr>
+      </w:pPr>
+    </w:p>
+    <w:tbl>
+      <w:tblPr>
+        <w:tblStyle w:val="TableGrid"/>
+        <w:tblW w:w="0" w:type="auto"/>
+        <w:tblInd w:w="10031" w:type="dxa"/>
+        <w:tblBorders>
+          <w:top w:val="none" w:sz="0" w:space="0" w:color="auto"/>
+          <w:left w:val="none" w:sz="0" w:space="0" w:color="auto"/>
+          <w:bottom w:val="none" w:sz="0" w:space="0" w:color="auto"/>
+          <w:right w:val="none" w:sz="0" w:space="0" w:color="auto"/>
+          <w:insideH w:val="none" w:sz="0" w:space="0" w:color="auto"/>
+          <w:insideV w:val="none" w:sz="0" w:space="0" w:color="auto"/>
+        </w:tblBorders>
+        <w:tblLook w:val="04A0" w:firstRow="1" w:lastRow="0" w:firstColumn="1" w:lastColumn="0" w:noHBand="0" w:noVBand="1"/>
+      </w:tblPr>
+      <w:tblGrid>
+        <w:gridCol w:w="902"/>
+        <w:gridCol w:w="4683"/>
+      </w:tblGrid>
+      <w:tr>
+        <w:tc>
+          <w:tcPr>
+            <w:tcW w:w="5585" w:type="dxa"/>
+            <w:gridSpan w:val="2"/>
+          </w:tcPr>
+          <w:p>
+            <w:pPr>
+              <w:tabs>
+                <w:tab w:val="left" w:pos="5244"/>
+              </w:tabs>
+              <w:rPr>
+                <w:rFonts w:asciiTheme="minorHAnsi" w:hAnsiTheme="minorHAnsi" w:cstheme="minorHAnsi"/>
+              </w:rPr>
+            </w:pPr>
+            <w:r>
+              <w:rPr>
+                <w:rFonts w:asciiTheme="minorHAnsi" w:hAnsiTheme="minorHAnsi" w:cstheme="minorHAnsi"/>
+              </w:rPr>
+              <w:lastRenderedPageBreak/>
+              <w:t>Lampiran</w:t>
+            </w:r>
+          </w:p>
+        </w:tc>
+      </w:tr>
+      <w:tr>
+        <w:tc>
+          <w:tcPr>
+            <w:tcW w:w="5585" w:type="dxa"/>
+            <w:gridSpan w:val="2"/>
+          </w:tcPr>
+          <w:p>
+            <w:pPr>
+              <w:tabs>
+                <w:tab w:val="left" w:pos="5244"/>
+              </w:tabs>
+              <w:rPr>
+                <w:rFonts w:asciiTheme="minorHAnsi" w:hAnsiTheme="minorHAnsi" w:cstheme="minorHAnsi"/>
+              </w:rPr>
+            </w:pPr>
+            <w:r>
+              <w:rPr>
+                <w:rFonts w:asciiTheme="minorHAnsi" w:hAnsiTheme="minorHAnsi" w:cstheme="minorHAnsi"/>
+                <w:color w:val="000000"/>
+              </w:rPr>
+              <w:t>Berita Acara Serah Terima Hasil Pekerjaan Petugas Lapangan Kegiatan Survei/Sensus Tahun 2026 Pada Badan Pusat Statistik Kabupaten Muara Enim</w:t>
+            </w:r>
+          </w:p>
+        </w:tc>
+      </w:tr>
+      <w:tr>
+        <w:tc>
+          <w:tcPr>
+            <w:tcW w:w="425" w:type="dxa"/>
+          </w:tcPr>
+          <w:p>
+            <w:pPr>
+              <w:tabs>
+                <w:tab w:val="left" w:pos="5244"/>
+              </w:tabs>
+              <w:rPr>
+                <w:rFonts w:asciiTheme="minorHAnsi" w:hAnsiTheme="minorHAnsi" w:cstheme="minorHAnsi"/>
+              </w:rPr>
+            </w:pPr>
+            <w:r>
+              <w:rPr>
+                <w:rFonts w:asciiTheme="minorHAnsi" w:hAnsiTheme="minorHAnsi" w:cstheme="minorHAnsi"/>
+              </w:rPr>
+              <w:t>Nomor:</w:t>
+            </w:r>
+          </w:p>
+        </w:tc>
+        <w:tc>
+          <w:tcPr>
+            <w:tcW w:w="5160" w:type="dxa"/>
+          </w:tcPr>
+          <w:p>
+            <w:pPr>
+              <w:rPr>
+                <w:rFonts w:asciiTheme="minorHAnsi" w:eastAsia="Times New Roman" w:hAnsiTheme="minorHAnsi" w:cstheme="minorHAnsi"/>
+                <w:color w:val="FF0000"/>
+                <w:lang w:val="en-ID"/>
+              </w:rPr>
+            </w:pPr>
+            <w:r>
+              <w:rPr>
+                <w:rFonts w:asciiTheme="minorHAnsi" w:hAnsiTheme="minorHAnsi" w:cstheme="minorHAnsi"/>
+                <w:color w:val="FF0000"/>
+              </w:rPr>
+              <w:t>{nomorBAST}</w:t>
+            </w:r>
+          </w:p>
+        </w:tc>
+      </w:tr>
+    </w:tbl>
+    <w:p>
+      <w:pPr>
+        <w:tabs>
+          <w:tab w:val="left" w:pos="5244"/>
+        </w:tabs>
+        <w:rPr>
+          <w:rFonts w:asciiTheme="minorHAnsi" w:hAnsiTheme="minorHAnsi" w:cstheme="minorHAnsi"/>
+        </w:rPr>
+      </w:pPr>
+    </w:p>
+    <w:tbl>
+      <w:tblPr>
+        <w:tblStyle w:val="TableGrid"/>
+        <w:tblW w:w="0" w:type="auto"/>
+        <w:tblLook w:val="04A0" w:firstRow="1" w:lastRow="0" w:firstColumn="1" w:lastColumn="0" w:noHBand="0" w:noVBand="1"/>
+      </w:tblPr>
+      <w:tblGrid>
+        <w:gridCol w:w="2602"/>
+        <w:gridCol w:w="2602"/>
+        <w:gridCol w:w="2603"/>
+        <w:gridCol w:w="2603"/>
+        <w:gridCol w:w="2603"/>
+        <w:gridCol w:w="2603"/>
+      </w:tblGrid>
+      <w:tr>
+        <w:tc>
+          <w:tcPr>
+            <w:tcW w:w="2602" w:type="dxa"/>
+            <w:vMerge w:val="restart"/>
+            <w:vAlign w:val="center"/>
+          </w:tcPr>
+          <w:p>
+            <w:pPr>
+              <w:tabs>
+                <w:tab w:val="left" w:pos="5244"/>
+              </w:tabs>
+              <w:jc w:val="center"/>
+              <w:rPr>
+                <w:rFonts w:asciiTheme="minorHAnsi" w:hAnsiTheme="minorHAnsi" w:cstheme="minorHAnsi"/>
+              </w:rPr>
+            </w:pPr>
+            <w:r>
+              <w:rPr>
+                <w:rFonts w:asciiTheme="minorHAnsi" w:hAnsiTheme="minorHAnsi" w:cstheme="minorHAnsi"/>
+              </w:rPr>
+              <w:t>No</w:t>
+            </w:r>
+          </w:p>
+        </w:tc>
+        <w:tc>
+          <w:tcPr>
+            <w:tcW w:w="2602" w:type="dxa"/>
+            <w:vMerge w:val="restart"/>
+            <w:vAlign w:val="center"/>
+          </w:tcPr>
+          <w:p>
+            <w:pPr>
+              <w:tabs>
+                <w:tab w:val="left" w:pos="5244"/>
+              </w:tabs>
+              <w:jc w:val="center"/>
+              <w:rPr>
+                <w:rFonts w:asciiTheme="minorHAnsi" w:hAnsiTheme="minorHAnsi" w:cstheme="minorHAnsi"/>
+              </w:rPr>
+            </w:pPr>
+            <w:r>
+              <w:rPr>
+                <w:rFonts w:asciiTheme="minorHAnsi" w:hAnsiTheme="minorHAnsi" w:cstheme="minorHAnsi"/>
+              </w:rPr>
+              <w:t>Uraian Pekerjaan</w:t>
+            </w:r>
+          </w:p>
+        </w:tc>
+        <w:tc>
+          <w:tcPr>
+            <w:tcW w:w="2603" w:type="dxa"/>
+            <w:vMerge w:val="restart"/>
+            <w:vAlign w:val="center"/>
+          </w:tcPr>
+          <w:p>
+            <w:pPr>
+              <w:tabs>
+                <w:tab w:val="left" w:pos="5244"/>
+              </w:tabs>
+              <w:jc w:val="center"/>
+              <w:rPr>
+                <w:rFonts w:asciiTheme="minorHAnsi" w:hAnsiTheme="minorHAnsi" w:cstheme="minorHAnsi"/>
+              </w:rPr>
+            </w:pPr>
+            <w:r>
+              <w:rPr>
+                <w:rFonts w:asciiTheme="minorHAnsi" w:hAnsiTheme="minorHAnsi" w:cstheme="minorHAnsi"/>
+              </w:rPr>
+              <w:t>Tanggal Penyelesaian</w:t>
+            </w:r>
+          </w:p>
+        </w:tc>
+        <w:tc>
+          <w:tcPr>
+            <w:tcW w:w="5206" w:type="dxa"/>
+            <w:gridSpan w:val="2"/>
+            <w:vAlign w:val="center"/>
+          </w:tcPr>
+          <w:p>
+            <w:pPr>
+              <w:tabs>
+                <w:tab w:val="left" w:pos="5244"/>
+              </w:tabs>
+              <w:jc w:val="center"/>
+              <w:rPr>
+                <w:rFonts w:asciiTheme="minorHAnsi" w:hAnsiTheme="minorHAnsi" w:cstheme="minorHAnsi"/>
+              </w:rPr>
+            </w:pPr>
+            <w:r>
+              <w:rPr>
+                <w:rFonts w:asciiTheme="minorHAnsi" w:hAnsiTheme="minorHAnsi" w:cstheme="minorHAnsi"/>
+              </w:rPr>
+              <w:t>Penyelesaian Pekerjaan</w:t>
+            </w:r>
+          </w:p>
+        </w:tc>
+        <w:tc>
+          <w:tcPr>
+            <w:tcW w:w="2603" w:type="dxa"/>
+            <w:vMerge w:val="restart"/>
+            <w:vAlign w:val="center"/>
+          </w:tcPr>
+          <w:p>
+            <w:pPr>
+              <w:tabs>
+                <w:tab w:val="left" w:pos="5244"/>
+              </w:tabs>
+              <w:jc w:val="center"/>
+              <w:rPr>
+                <w:rFonts w:asciiTheme="minorHAnsi" w:hAnsiTheme="minorHAnsi" w:cstheme="minorHAnsi"/>
+              </w:rPr>
+            </w:pPr>
+            <w:r>
+              <w:rPr>
+                <w:rFonts w:asciiTheme="minorHAnsi" w:hAnsiTheme="minorHAnsi" w:cstheme="minorHAnsi"/>
+              </w:rPr>
+              <w:t>Beban Anggaran</w:t>
+            </w:r>
+          </w:p>
+        </w:tc>
+      </w:tr>
+      <w:tr>
+        <w:tc>
+          <w:tcPr>
+            <w:tcW w:w="2602" w:type="dxa"/>
+            <w:vMerge/>
+          </w:tcPr>
+          <w:p>
+            <w:pPr>
+              <w:tabs>
+                <w:tab w:val="left" w:pos="5244"/>
+              </w:tabs>
+              <w:rPr>
+                <w:rFonts w:asciiTheme="minorHAnsi" w:hAnsiTheme="minorHAnsi" w:cstheme="minorHAnsi"/>
+              </w:rPr>
+            </w:pPr>
+          </w:p>
+        </w:tc>
+        <w:tc>
+          <w:tcPr>
+            <w:tcW w:w="2602" w:type="dxa"/>
+            <w:vMerge/>
+          </w:tcPr>
+          <w:p>
+            <w:pPr>
+              <w:tabs>
+                <w:tab w:val="left" w:pos="5244"/>
+              </w:tabs>
+              <w:rPr>
+                <w:rFonts w:asciiTheme="minorHAnsi" w:hAnsiTheme="minorHAnsi" w:cstheme="minorHAnsi"/>
+              </w:rPr>
+            </w:pPr>
+          </w:p>
+        </w:tc>
+        <w:tc>
+          <w:tcPr>
+            <w:tcW w:w="2603" w:type="dxa"/>
+            <w:vMerge/>
+          </w:tcPr>
+          <w:p>
+            <w:pPr>
+              <w:tabs>
+                <w:tab w:val="left" w:pos="5244"/>
+              </w:tabs>
+              <w:rPr>
+                <w:rFonts w:asciiTheme="minorHAnsi" w:hAnsiTheme="minorHAnsi" w:cstheme="minorHAnsi"/>
+              </w:rPr>
+            </w:pPr>
+          </w:p>
+        </w:tc>
+        <w:tc>
+          <w:tcPr>
+            <w:tcW w:w="2603" w:type="dxa"/>
+          </w:tcPr>
+          <w:p>
+            <w:pPr>
+              <w:tabs>
+                <w:tab w:val="left" w:pos="5244"/>
+              </w:tabs>
+              <w:rPr>
+                <w:rFonts w:asciiTheme="minorHAnsi" w:hAnsiTheme="minorHAnsi" w:cstheme="minorHAnsi"/>
+              </w:rPr>
+            </w:pPr>
+            <w:r>
+              <w:rPr>
+                <w:rFonts w:asciiTheme="minorHAnsi" w:hAnsiTheme="minorHAnsi" w:cstheme="minorHAnsi"/>
+              </w:rPr>
+              <w:t>Volume</w:t>
+            </w:r>
+          </w:p>
+        </w:tc>
+        <w:tc>
+          <w:tcPr>
+            <w:tcW w:w="2603" w:type="dxa"/>
+          </w:tcPr>
+          <w:p>
+            <w:pPr>
+              <w:tabs>
+                <w:tab w:val="left" w:pos="5244"/>
+              </w:tabs>
+              <w:rPr>
+                <w:rFonts w:asciiTheme="minorHAnsi" w:hAnsiTheme="minorHAnsi" w:cstheme="minorHAnsi"/>
+              </w:rPr>
+            </w:pPr>
+            <w:r>
+              <w:rPr>
+                <w:rFonts w:asciiTheme="minorHAnsi" w:hAnsiTheme="minorHAnsi" w:cstheme="minorHAnsi"/>
+              </w:rPr>
+              <w:t>Satuan</w:t>
+            </w:r>
+          </w:p>
+        </w:tc>
+        <w:tc>
+          <w:tcPr>
+            <w:tcW w:w="2603" w:type="dxa"/>
+            <w:vMerge/>
+          </w:tcPr>
+          <w:p>
+            <w:pPr>
+              <w:tabs>
+                <w:tab w:val="left" w:pos="5244"/>
+              </w:tabs>
+              <w:rPr>
+                <w:rFonts w:asciiTheme="minorHAnsi" w:hAnsiTheme="minorHAnsi" w:cstheme="minorHAnsi"/>
+              </w:rPr>
+            </w:pPr>
+          </w:p>
+        </w:tc>
+      </w:tr>
+      <w:tr>
+        <w:tc>
+          <w:tcPr>
+            <w:tcW w:w="2602" w:type="dxa"/>
+            <w:vAlign w:val="center"/>
+          </w:tcPr>
+          <w:p>
+            <w:pPr>
+              <w:tabs>
+                <w:tab w:val="left" w:pos="5244"/>
+              </w:tabs>
+              <w:jc w:val="center"/>
+              <w:rPr>
+                <w:rFonts w:asciiTheme="minorHAnsi" w:hAnsiTheme="minorHAnsi" w:cstheme="minorHAnsi"/>
+              </w:rPr>
+            </w:pPr>
+            <w:r>
+              <w:rPr>
+                <w:rFonts w:asciiTheme="minorHAnsi" w:hAnsiTheme="minorHAnsi" w:cstheme="minorHAnsi"/>
+              </w:rPr>
+              <w:t>(1)</w:t>
+            </w:r>
+          </w:p>
+        </w:tc>
+        <w:tc>
+          <w:tcPr>
+            <w:tcW w:w="2602" w:type="dxa"/>
+            <w:vAlign w:val="center"/>
+          </w:tcPr>
+          <w:p>
+            <w:pPr>
+              <w:tabs>
+                <w:tab w:val="left" w:pos="5244"/>
+              </w:tabs>
+              <w:jc w:val="center"/>
+              <w:rPr>
+                <w:rFonts w:asciiTheme="minorHAnsi" w:hAnsiTheme="minorHAnsi" w:cstheme="minorHAnsi"/>
+              </w:rPr>
+            </w:pPr>
+            <w:r>
+              <w:rPr>
+                <w:rFonts w:asciiTheme="minorHAnsi" w:hAnsiTheme="minorHAnsi" w:cstheme="minorHAnsi"/>
+              </w:rPr>
+              <w:t>(2)</w:t>
+            </w:r>
+          </w:p>
+        </w:tc>
+        <w:tc>
+          <w:tcPr>
+            <w:tcW w:w="2603" w:type="dxa"/>
+            <w:vAlign w:val="center"/>
+          </w:tcPr>
+          <w:p>
+            <w:pPr>
+              <w:tabs>
+                <w:tab w:val="left" w:pos="5244"/>
+              </w:tabs>
+              <w:jc w:val="center"/>
+              <w:rPr>
+                <w:rFonts w:asciiTheme="minorHAnsi" w:hAnsiTheme="minorHAnsi" w:cstheme="minorHAnsi"/>
+              </w:rPr>
+            </w:pPr>
+            <w:r>
+              <w:rPr>
+                <w:rFonts w:asciiTheme="minorHAnsi" w:hAnsiTheme="minorHAnsi" w:cstheme="minorHAnsi"/>
+              </w:rPr>
+              <w:t>(3)</w:t>
+            </w:r>
+          </w:p>
+        </w:tc>
+        <w:tc>
+          <w:tcPr>
+            <w:tcW w:w="2603" w:type="dxa"/>
+            <w:vAlign w:val="center"/>
+          </w:tcPr>
+          <w:p>
+            <w:pPr>
+              <w:tabs>
+                <w:tab w:val="left" w:pos="5244"/>
+              </w:tabs>
+              <w:jc w:val="center"/>
+              <w:rPr>
+                <w:rFonts w:asciiTheme="minorHAnsi" w:hAnsiTheme="minorHAnsi" w:cstheme="minorHAnsi"/>
+              </w:rPr>
+            </w:pPr>
+            <w:r>
+              <w:rPr>
+                <w:rFonts w:asciiTheme="minorHAnsi" w:hAnsiTheme="minorHAnsi" w:cstheme="minorHAnsi"/>
+              </w:rPr>
+              <w:t>(4)</w:t>
+            </w:r>
+          </w:p>
+        </w:tc>
+        <w:tc>
+          <w:tcPr>
+            <w:tcW w:w="2603" w:type="dxa"/>
+            <w:vAlign w:val="center"/>
+          </w:tcPr>
+          <w:p>
+            <w:pPr>
+              <w:tabs>
+                <w:tab w:val="left" w:pos="5244"/>
+              </w:tabs>
+              <w:jc w:val="center"/>
+              <w:rPr>
+                <w:rFonts w:asciiTheme="minorHAnsi" w:hAnsiTheme="minorHAnsi" w:cstheme="minorHAnsi"/>
+              </w:rPr>
+            </w:pPr>
+            <w:r>
+              <w:rPr>
+                <w:rFonts w:asciiTheme="minorHAnsi" w:hAnsiTheme="minorHAnsi" w:cstheme="minorHAnsi"/>
+              </w:rPr>
+              <w:t>(5)</w:t>
+            </w:r>
+          </w:p>
+        </w:tc>
+        <w:tc>
+          <w:tcPr>
+            <w:tcW w:w="2603" w:type="dxa"/>
+            <w:vAlign w:val="center"/>
+          </w:tcPr>
+          <w:p>
+            <w:pPr>
+              <w:tabs>
+                <w:tab w:val="left" w:pos="5244"/>
+              </w:tabs>
+              <w:jc w:val="center"/>
+              <w:rPr>
+                <w:rFonts w:asciiTheme="minorHAnsi" w:hAnsiTheme="minorHAnsi" w:cstheme="minorHAnsi"/>
+              </w:rPr>
+            </w:pPr>
+            <w:r>
+              <w:rPr>
+                <w:rFonts w:asciiTheme="minorHAnsi" w:hAnsiTheme="minorHAnsi" w:cstheme="minorHAnsi"/>
+              </w:rPr>
+              <w:t>(6)</w:t>
+            </w:r>
+          </w:p>
+        </w:tc>
+      </w:tr>
+      <w:tr>
+        <w:tc>
+          <w:tcPr>
+            <w:tcW w:w="2602" w:type="dxa"/>
+            <w:vAlign w:val="center"/>
+          </w:tcPr>
+          <w:p>
+            <w:pPr>
+              <w:tabs>
+                <w:tab w:val="left" w:pos="5244"/>
+              </w:tabs>
+              <w:jc w:val="center"/>
+              <w:rPr>
+                <w:rFonts w:asciiTheme="minorHAnsi" w:hAnsiTheme="minorHAnsi" w:cstheme="minorHAnsi"/>
+              </w:rPr>
+            </w:pPr>
+            <w:r>
+              <w:rPr>
+                <w:rFonts w:asciiTheme="minorHAnsi" w:hAnsiTheme="minorHAnsi" w:cstheme="minorHAnsi"/>
+              </w:rPr>
+              <w:t>{#rows}</w:t>
+            </w:r>
+          </w:p>
+        </w:tc>
+        <w:tc>
+          <w:tcPr>
+            <w:tcW w:w="2602" w:type="dxa"/>
+            <w:vAlign w:val="center"/>
+          </w:tcPr>
+          <w:p>
+            <w:pPr>
+              <w:tabs>
+                <w:tab w:val="left" w:pos="5244"/>
+              </w:tabs>
+              <w:jc w:val="center"/>
+              <w:rPr>
+                <w:rFonts w:asciiTheme="minorHAnsi" w:hAnsiTheme="minorHAnsi" w:cstheme="minorHAnsi"/>
+              </w:rPr>
+            </w:pPr>
+          </w:p>
+        </w:tc>
+        <w:tc>
+          <w:tcPr>
+            <w:tcW w:w="2603" w:type="dxa"/>
+            <w:vAlign w:val="center"/>
+          </w:tcPr>
+          <w:p>
+            <w:pPr>
+              <w:tabs>
+                <w:tab w:val="left" w:pos="5244"/>
+              </w:tabs>
+              <w:jc w:val="center"/>
+              <w:rPr>
+                <w:rFonts w:asciiTheme="minorHAnsi" w:hAnsiTheme="minorHAnsi" w:cstheme="minorHAnsi"/>
+              </w:rPr>
+            </w:pPr>
+          </w:p>
+        </w:tc>
+        <w:tc>
+          <w:tcPr>
+            <w:tcW w:w="2603" w:type="dxa"/>
+            <w:vAlign w:val="center"/>
+          </w:tcPr>
+          <w:p>
+            <w:pPr>
+              <w:tabs>
+                <w:tab w:val="left" w:pos="5244"/>
+              </w:tabs>
+              <w:jc w:val="center"/>
+              <w:rPr>
+                <w:rFonts w:asciiTheme="minorHAnsi" w:hAnsiTheme="minorHAnsi" w:cstheme="minorHAnsi"/>
+              </w:rPr>
+            </w:pPr>
+          </w:p>
+        </w:tc>
+        <w:tc>
+          <w:tcPr>
+            <w:tcW w:w="2603" w:type="dxa"/>
+            <w:vAlign w:val="center"/>
+          </w:tcPr>
+          <w:p>
+            <w:pPr>
+              <w:tabs>
+                <w:tab w:val="left" w:pos="5244"/>
+              </w:tabs>
+              <w:jc w:val="center"/>
+              <w:rPr>
+                <w:rFonts w:asciiTheme="minorHAnsi" w:hAnsiTheme="minorHAnsi" w:cstheme="minorHAnsi"/>
+              </w:rPr>
+            </w:pPr>
+          </w:p>
+        </w:tc>
+        <w:tc>
+          <w:tcPr>
+            <w:tcW w:w="2603" w:type="dxa"/>
+            <w:vAlign w:val="center"/>
+          </w:tcPr>
+          <w:p>
+            <w:pPr>
+              <w:tabs>
+                <w:tab w:val="left" w:pos="5244"/>
+              </w:tabs>
+              <w:jc w:val="center"/>
+              <w:rPr>
+                <w:rFonts w:asciiTheme="minorHAnsi" w:hAnsiTheme="minorHAnsi" w:cstheme="minorHAnsi"/>
+              </w:rPr>
+            </w:pPr>
+          </w:p>
+        </w:tc>
+      </w:tr>
+      <w:tr>
+        <w:tc>
+          <w:tcPr>
+            <w:tcW w:w="2602" w:type="dxa"/>
+            <w:vAlign w:val="center"/>
+          </w:tcPr>
+          <w:p>
+            <w:pPr>
+              <w:tabs>
+                <w:tab w:val="left" w:pos="5244"/>
+              </w:tabs>
+              <w:jc w:val="center"/>
+              <w:rPr>
+                <w:rFonts w:asciiTheme="minorHAnsi" w:hAnsiTheme="minorHAnsi" w:cstheme="minorHAnsi"/>
+                <w:color w:val="FF0000"/>
+              </w:rPr>
+            </w:pPr>
+            <w:r>
+              <w:rPr>
+                <w:rFonts w:asciiTheme="minorHAnsi" w:hAnsiTheme="minorHAnsi" w:cstheme="minorHAnsi"/>
+                <w:color w:val="FF0000"/>
+              </w:rPr>
+              <w:t>{no}</w:t>
+            </w:r>
+          </w:p>
+        </w:tc>
+        <w:tc>
+          <w:tcPr>
+            <w:tcW w:w="2602" w:type="dxa"/>
+            <w:vAlign w:val="center"/>
+          </w:tcPr>
+          <w:p>
+            <w:pPr>
+              <w:tabs>
+                <w:tab w:val="left" w:pos="5244"/>
+              </w:tabs>
+              <w:rPr>
+                <w:rFonts w:asciiTheme="minorHAnsi" w:hAnsiTheme="minorHAnsi" w:cstheme="minorHAnsi"/>
+                <w:color w:val="FF0000"/>
+              </w:rPr>
+            </w:pPr>
+            <w:r>
+              <w:rPr>
+                <w:rFonts w:asciiTheme="minorHAnsi" w:hAnsiTheme="minorHAnsi" w:cstheme="minorHAnsi"/>
+                <w:color w:val="FF0000"/>
+              </w:rPr>
+              <w:t>{kegiatan}</w:t>
+            </w:r>
+          </w:p>
+        </w:tc>
+        <w:tc>
+          <w:tcPr>
+            <w:tcW w:w="2603" w:type="dxa"/>
+            <w:vAlign w:val="center"/>
+          </w:tcPr>
+          <w:p>
+            <w:pPr>
+              <w:tabs>
+                <w:tab w:val="left" w:pos="5244"/>
+              </w:tabs>
+              <w:jc w:val="center"/>
+              <w:rPr>
+                <w:rFonts w:asciiTheme="minorHAnsi" w:hAnsiTheme="minorHAnsi" w:cstheme="minorHAnsi"/>
+                <w:color w:val="FF0000"/>
+              </w:rPr>
+            </w:pPr>
+            <w:r>
+              <w:rPr>
+                <w:rFonts w:asciiTheme="minorHAnsi" w:hAnsiTheme="minorHAnsi" w:cstheme="minorHAnsi"/>
+                <w:color w:val="FF0000"/>
+              </w:rPr>
+              <w:t>{tglSelesai}</w:t>
+            </w:r>
+          </w:p>
+        </w:tc>
+        <w:tc>
+          <w:tcPr>
+            <w:tcW w:w="2603" w:type="dxa"/>
+            <w:vAlign w:val="center"/>
+          </w:tcPr>
+          <w:p>
+            <w:pPr>
+              <w:tabs>
+                <w:tab w:val="left" w:pos="5244"/>
+              </w:tabs>
+              <w:jc w:val="center"/>
+              <w:rPr>
+                <w:rFonts w:asciiTheme="minorHAnsi" w:hAnsiTheme="minorHAnsi" w:cstheme="minorHAnsi"/>
+                <w:color w:val="FF0000"/>
+              </w:rPr>
+            </w:pPr>
+            <w:r>
+              <w:rPr>
+                <w:rFonts w:asciiTheme="minorHAnsi" w:hAnsiTheme="minorHAnsi" w:cstheme="minorHAnsi"/>
+                <w:color w:val="FF0000"/>
+              </w:rPr>
+              <w:t>{volume}</w:t>
+            </w:r>
+          </w:p>
+        </w:tc>
+        <w:tc>
+          <w:tcPr>
+            <w:tcW w:w="2603" w:type="dxa"/>
+            <w:vAlign w:val="center"/>
+          </w:tcPr>
+          <w:p>
+            <w:pPr>
+              <w:tabs>
+                <w:tab w:val="left" w:pos="5244"/>
+              </w:tabs>
+              <w:jc w:val="center"/>
+              <w:rPr>
+                <w:rFonts w:asciiTheme="minorHAnsi" w:hAnsiTheme="minorHAnsi" w:cstheme="minorHAnsi"/>
+                <w:color w:val="FF0000"/>
+              </w:rPr>
+            </w:pPr>
+            <w:r>
+              <w:rPr>
+                <w:rFonts w:asciiTheme="minorHAnsi" w:hAnsiTheme="minorHAnsi" w:cstheme="minorHAnsi"/>
+                <w:color w:val="FF0000"/>
+              </w:rPr>
+              <w:t>{satuan}</w:t>
+            </w:r>
+          </w:p>
+        </w:tc>
+        <w:tc>
+          <w:tcPr>
+            <w:tcW w:w="2603" w:type="dxa"/>
+            <w:vAlign w:val="center"/>
+          </w:tcPr>
+          <w:p>
+            <w:pPr>
+              <w:tabs>
+                <w:tab w:val="left" w:pos="5244"/>
+              </w:tabs>
+              <w:jc w:val="center"/>
+              <w:rPr>
+                <w:rFonts w:asciiTheme="minorHAnsi" w:hAnsiTheme="minorHAnsi" w:cstheme="minorHAnsi"/>
+                <w:color w:val="FF0000"/>
+              </w:rPr>
+            </w:pPr>
+            <w:r>
+              <w:rPr>
+                <w:rFonts w:asciiTheme="minorHAnsi" w:hAnsiTheme="minorHAnsi" w:cstheme="minorHAnsi"/>
+                <w:color w:val="FF0000"/>
+              </w:rPr>
+              <w:t>{bebanAnggaran}</w:t>
+            </w:r>
+          </w:p>
+        </w:tc>
+      </w:tr>
+      <w:tr>
+        <w:tc>
+          <w:tcPr>
+            <w:tcW w:w="2602" w:type="dxa"/>
+            <w:vAlign w:val="center"/>
+          </w:tcPr>
+          <w:p>
+            <w:pPr>
+              <w:tabs>
+                <w:tab w:val="left" w:pos="5244"/>
+              </w:tabs>
+              <w:jc w:val="center"/>
+              <w:rPr>
+                <w:rFonts w:asciiTheme="minorHAnsi" w:hAnsiTheme="minorHAnsi" w:cstheme="minorHAnsi"/>
+                <w:color w:val="FF0000"/>
+              </w:rPr>
+            </w:pPr>
+            <w:r>
+              <w:rPr>
+                <w:rFonts w:asciiTheme="minorHAnsi" w:hAnsiTheme="minorHAnsi" w:cstheme="minorHAnsi"/>
+                <w:color w:val="FF0000"/>
+              </w:rPr>
+              <w:t>{/rows}</w:t>
+            </w:r>
+          </w:p>
+        </w:tc>
+        <w:tc>
+          <w:tcPr>
+            <w:tcW w:w="2602" w:type="dxa"/>
+            <w:vAlign w:val="center"/>
+          </w:tcPr>
+          <w:p>
+            <w:pPr>
+              <w:tabs>
+                <w:tab w:val="left" w:pos="5244"/>
+              </w:tabs>
+              <w:rPr>
+                <w:rFonts w:asciiTheme="minorHAnsi" w:hAnsiTheme="minorHAnsi" w:cstheme="minorHAnsi"/>
+                <w:color w:val="FF0000"/>
+              </w:rPr>
+            </w:pPr>
+          </w:p>
+        </w:tc>
+        <w:tc>
+          <w:tcPr>
+            <w:tcW w:w="2603" w:type="dxa"/>
+            <w:vAlign w:val="center"/>
+          </w:tcPr>
+          <w:p>
+            <w:pPr>
+              <w:tabs>
+                <w:tab w:val="left" w:pos="5244"/>
+              </w:tabs>
+              <w:jc w:val="center"/>
+              <w:rPr>
+                <w:rFonts w:asciiTheme="minorHAnsi" w:hAnsiTheme="minorHAnsi" w:cstheme="minorHAnsi"/>
+                <w:color w:val="FF0000"/>
+              </w:rPr>
+            </w:pPr>
+          </w:p>
+        </w:tc>
+        <w:tc>
+          <w:tcPr>
+            <w:tcW w:w="2603" w:type="dxa"/>
+            <w:vAlign w:val="center"/>
+          </w:tcPr>
+          <w:p>
+            <w:pPr>
+              <w:tabs>
+                <w:tab w:val="left" w:pos="5244"/>
+              </w:tabs>
+              <w:jc w:val="center"/>
+              <w:rPr>
+                <w:rFonts w:asciiTheme="minorHAnsi" w:hAnsiTheme="minorHAnsi" w:cstheme="minorHAnsi"/>
+                <w:color w:val="FF0000"/>
+              </w:rPr>
+            </w:pPr>
+          </w:p>
+        </w:tc>
+        <w:tc>
+          <w:tcPr>
+            <w:tcW w:w="2603" w:type="dxa"/>
+            <w:vAlign w:val="center"/>
+          </w:tcPr>
+          <w:p>
+            <w:pPr>
+              <w:tabs>
+                <w:tab w:val="left" w:pos="5244"/>
+              </w:tabs>
+              <w:jc w:val="center"/>
+              <w:rPr>
+                <w:rFonts w:asciiTheme="minorHAnsi" w:hAnsiTheme="minorHAnsi" w:cstheme="minorHAnsi"/>
+                <w:color w:val="FF0000"/>
+              </w:rPr>
+            </w:pPr>
+          </w:p>
+        </w:tc>
+        <w:tc>
+          <w:tcPr>
+            <w:tcW w:w="2603" w:type="dxa"/>
+            <w:vAlign w:val="center"/>
+          </w:tcPr>
+          <w:p>
+            <w:pPr>
+              <w:tabs>
+                <w:tab w:val="left" w:pos="5244"/>
+              </w:tabs>
+              <w:jc w:val="center"/>
+              <w:rPr>
+                <w:rFonts w:asciiTheme="minorHAnsi" w:hAnsiTheme="minorHAnsi" w:cstheme="minorHAnsi"/>
+                <w:color w:val="FF0000"/>
+              </w:rPr>
+            </w:pPr>
+          </w:p>
+        </w:tc>
+      </w:tr>
+    </w:tbl>
+    <w:p>
+      <w:pPr>
+        <w:tabs>
+          <w:tab w:val="left" w:pos="5244"/>
+        </w:tabs>
+        <w:rPr>
+          <w:rFonts w:asciiTheme="minorHAnsi" w:hAnsiTheme="minorHAnsi" w:cstheme="minorHAnsi"/>
+        </w:rPr>
       </w:pPr>
     </w:p>
     <w:sectPr>
-      <w:headerReference w:type="default" r:id="rId10"/>
-      <w:footerReference w:type="default" r:id="rId11"/>
       <w:type w:val="continuous"/>
-      <w:pgSz w:w="11910" w:h="16840"/>
-      <w:pgMar w:top="620" w:right="960" w:bottom="820" w:left="1480" w:header="720" w:footer="720" w:gutter="0"/>
+      <w:pgSz w:w="16840" w:h="11910" w:orient="landscape"/>
+      <w:pgMar w:top="958" w:right="822" w:bottom="1480" w:left="618" w:header="720" w:footer="720" w:gutter="0"/>
       <w:cols w:space="720"/>
     </w:sectPr>
   </w:body>
@@ -1466,7 +2521,7 @@
 </file>
 
 <file path=word/endnotes.xml><?xml version="1.0" encoding="utf-8"?>
-<w:endnotes xmlns:wpc="http://schemas.microsoft.com/office/word/2010/wordprocessingCanvas" xmlns:cx="http://schemas.microsoft.com/office/drawing/2014/chartex" xmlns:cx1="http://schemas.microsoft.com/office/drawing/2015/9/8/chartex" xmlns:cx2="http://schemas.microsoft.com/office/drawing/2015/10/21/chartex" xmlns:cx3="http://schemas.microsoft.com/office/drawing/2016/5/9/chartex" xmlns:cx4="http://schemas.microsoft.com/office/drawing/2016/5/10/chartex" xmlns:cx5="http://schemas.microsoft.com/office/drawing/2016/5/11/chartex" xmlns:cx6="http://schemas.microsoft.com/office/drawing/2016/5/12/chartex" xmlns:cx7="http://schemas.microsoft.com/office/drawing/2016/5/13/chartex" xmlns:cx8="http://schemas.microsoft.com/office/drawing/2016/5/14/chartex" xmlns:mc="http://schemas.openxmlformats.org/markup-compatibility/2006" xmlns:aink="http://schemas.microsoft.com/office/drawing/2016/ink" xmlns:am3d="http://schemas.microsoft.com/office/drawing/2017/model3d" xmlns:o="urn:schemas-microsoft-com:office:office" xmlns:oel="http://schemas.microsoft.com/office/2019/extlst" xmlns:r="http://schemas.openxmlformats.org/officeDocument/2006/relationships" xmlns:m="http://schemas.openxmlformats.org/officeDocument/2006/math" xmlns:v="urn:schemas-microsoft-com:vml" xmlns:wp14="http://schemas.microsoft.com/office/word/2010/wordprocessingDrawing" xmlns:wp="http://schemas.openxmlformats.org/drawingml/2006/wordprocessingDrawing" xmlns:w10="urn:schemas-microsoft-com:office:word" xmlns:w="http://schemas.openxmlformats.org/wordprocessingml/2006/main" xmlns:w14="http://schemas.microsoft.com/office/word/2010/wordml" xmlns:w15="http://schemas.microsoft.com/office/word/2012/wordml" xmlns:w16cex="http://schemas.microsoft.com/office/word/2018/wordml/cex" xmlns:w16cid="http://schemas.microsoft.com/office/word/2016/wordml/cid" xmlns:w16="http://schemas.microsoft.com/office/word/2018/wordml" xmlns:w16du="http://schemas.microsoft.com/office/word/2023/wordml/word16du" xmlns:w16sdtdh="http://schemas.microsoft.com/office/word/2020/wordml/sdtdatahash" xmlns:w16sdtfl="http://schemas.microsoft.com/office/word/2024/wordml/sdtformatlock" xmlns:w16se="http://schemas.microsoft.com/office/word/2015/wordml/symex" xmlns:wpg="http://schemas.microsoft.com/office/word/2010/wordprocessingGroup" xmlns:wpi="http://schemas.microsoft.com/office/word/2010/wordprocessingInk" xmlns:wne="http://schemas.microsoft.com/office/word/2006/wordml" xmlns:wps="http://schemas.microsoft.com/office/word/2010/wordprocessingShape" mc:Ignorable="w14 w15 w16se w16cid w16 w16cex w16sdtdh w16sdtfl w16du wp14">
+<w:endnotes xmlns:wpc="http://schemas.microsoft.com/office/word/2010/wordprocessingCanvas" xmlns:cx="http://schemas.microsoft.com/office/drawing/2014/chartex" xmlns:cx1="http://schemas.microsoft.com/office/drawing/2015/9/8/chartex" xmlns:cx2="http://schemas.microsoft.com/office/drawing/2015/10/21/chartex" xmlns:cx3="http://schemas.microsoft.com/office/drawing/2016/5/9/chartex" xmlns:cx4="http://schemas.microsoft.com/office/drawing/2016/5/10/chartex" xmlns:cx5="http://schemas.microsoft.com/office/drawing/2016/5/11/chartex" xmlns:cx6="http://schemas.microsoft.com/office/drawing/2016/5/12/chartex" xmlns:cx7="http://schemas.microsoft.com/office/drawing/2016/5/13/chartex" xmlns:cx8="http://schemas.microsoft.com/office/drawing/2016/5/14/chartex" xmlns:mc="http://schemas.openxmlformats.org/markup-compatibility/2006" xmlns:aink="http://schemas.microsoft.com/office/drawing/2016/ink" xmlns:am3d="http://schemas.microsoft.com/office/drawing/2017/model3d" xmlns:o="urn:schemas-microsoft-com:office:office" xmlns:r="http://schemas.openxmlformats.org/officeDocument/2006/relationships" xmlns:m="http://schemas.openxmlformats.org/officeDocument/2006/math" xmlns:v="urn:schemas-microsoft-com:vml" xmlns:wp14="http://schemas.microsoft.com/office/word/2010/wordprocessingDrawing" xmlns:wp="http://schemas.openxmlformats.org/drawingml/2006/wordprocessingDrawing" xmlns:w10="urn:schemas-microsoft-com:office:word" xmlns:w="http://schemas.openxmlformats.org/wordprocessingml/2006/main" xmlns:w14="http://schemas.microsoft.com/office/word/2010/wordml" xmlns:w15="http://schemas.microsoft.com/office/word/2012/wordml" xmlns:w16cex="http://schemas.microsoft.com/office/word/2018/wordml/cex" xmlns:w16cid="http://schemas.microsoft.com/office/word/2016/wordml/cid" xmlns:w16="http://schemas.microsoft.com/office/word/2018/wordml" xmlns:w16sdtdh="http://schemas.microsoft.com/office/word/2020/wordml/sdtdatahash" xmlns:w16se="http://schemas.microsoft.com/office/word/2015/wordml/symex" xmlns:wpg="http://schemas.microsoft.com/office/word/2010/wordprocessingGroup" xmlns:wpi="http://schemas.microsoft.com/office/word/2010/wordprocessingInk" xmlns:wne="http://schemas.microsoft.com/office/word/2006/wordml" xmlns:wps="http://schemas.microsoft.com/office/word/2010/wordprocessingShape" mc:Ignorable="w14 w15 w16se w16cid w16 w16cex w16sdtdh wp14">
   <w:endnote w:type="separator" w:id="-1">
     <w:p>
       <w:r>
@@ -1485,7 +2540,7 @@
 </file>
 
 <file path=word/footer1.xml><?xml version="1.0" encoding="utf-8"?>
-<w:ftr xmlns:wpc="http://schemas.microsoft.com/office/word/2010/wordprocessingCanvas" xmlns:cx="http://schemas.microsoft.com/office/drawing/2014/chartex" xmlns:cx1="http://schemas.microsoft.com/office/drawing/2015/9/8/chartex" xmlns:cx2="http://schemas.microsoft.com/office/drawing/2015/10/21/chartex" xmlns:cx3="http://schemas.microsoft.com/office/drawing/2016/5/9/chartex" xmlns:cx4="http://schemas.microsoft.com/office/drawing/2016/5/10/chartex" xmlns:cx5="http://schemas.microsoft.com/office/drawing/2016/5/11/chartex" xmlns:cx6="http://schemas.microsoft.com/office/drawing/2016/5/12/chartex" xmlns:cx7="http://schemas.microsoft.com/office/drawing/2016/5/13/chartex" xmlns:cx8="http://schemas.microsoft.com/office/drawing/2016/5/14/chartex" xmlns:mc="http://schemas.openxmlformats.org/markup-compatibility/2006" xmlns:aink="http://schemas.microsoft.com/office/drawing/2016/ink" xmlns:am3d="http://schemas.microsoft.com/office/drawing/2017/model3d" xmlns:o="urn:schemas-microsoft-com:office:office" xmlns:oel="http://schemas.microsoft.com/office/2019/extlst" xmlns:r="http://schemas.openxmlformats.org/officeDocument/2006/relationships" xmlns:m="http://schemas.openxmlformats.org/officeDocument/2006/math" xmlns:v="urn:schemas-microsoft-com:vml" xmlns:wp14="http://schemas.microsoft.com/office/word/2010/wordprocessingDrawing" xmlns:wp="http://schemas.openxmlformats.org/drawingml/2006/wordprocessingDrawing" xmlns:w10="urn:schemas-microsoft-com:office:word" xmlns:w="http://schemas.openxmlformats.org/wordprocessingml/2006/main" xmlns:w14="http://schemas.microsoft.com/office/word/2010/wordml" xmlns:w15="http://schemas.microsoft.com/office/word/2012/wordml" xmlns:w16cex="http://schemas.microsoft.com/office/word/2018/wordml/cex" xmlns:w16cid="http://schemas.microsoft.com/office/word/2016/wordml/cid" xmlns:w16="http://schemas.microsoft.com/office/word/2018/wordml" xmlns:w16du="http://schemas.microsoft.com/office/word/2023/wordml/word16du" xmlns:w16sdtdh="http://schemas.microsoft.com/office/word/2020/wordml/sdtdatahash" xmlns:w16sdtfl="http://schemas.microsoft.com/office/word/2024/wordml/sdtformatlock" xmlns:w16se="http://schemas.microsoft.com/office/word/2015/wordml/symex" xmlns:wpg="http://schemas.microsoft.com/office/word/2010/wordprocessingGroup" xmlns:wpi="http://schemas.microsoft.com/office/word/2010/wordprocessingInk" xmlns:wne="http://schemas.microsoft.com/office/word/2006/wordml" xmlns:wps="http://schemas.microsoft.com/office/word/2010/wordprocessingShape" mc:Ignorable="w14 w15 w16se w16cid w16 w16cex w16sdtdh w16sdtfl w16du wp14">
+<w:ftr xmlns:wpc="http://schemas.microsoft.com/office/word/2010/wordprocessingCanvas" xmlns:cx="http://schemas.microsoft.com/office/drawing/2014/chartex" xmlns:cx1="http://schemas.microsoft.com/office/drawing/2015/9/8/chartex" xmlns:cx2="http://schemas.microsoft.com/office/drawing/2015/10/21/chartex" xmlns:cx3="http://schemas.microsoft.com/office/drawing/2016/5/9/chartex" xmlns:cx4="http://schemas.microsoft.com/office/drawing/2016/5/10/chartex" xmlns:cx5="http://schemas.microsoft.com/office/drawing/2016/5/11/chartex" xmlns:cx6="http://schemas.microsoft.com/office/drawing/2016/5/12/chartex" xmlns:cx7="http://schemas.microsoft.com/office/drawing/2016/5/13/chartex" xmlns:cx8="http://schemas.microsoft.com/office/drawing/2016/5/14/chartex" xmlns:mc="http://schemas.openxmlformats.org/markup-compatibility/2006" xmlns:aink="http://schemas.microsoft.com/office/drawing/2016/ink" xmlns:am3d="http://schemas.microsoft.com/office/drawing/2017/model3d" xmlns:o="urn:schemas-microsoft-com:office:office" xmlns:r="http://schemas.openxmlformats.org/officeDocument/2006/relationships" xmlns:m="http://schemas.openxmlformats.org/officeDocument/2006/math" xmlns:v="urn:schemas-microsoft-com:vml" xmlns:wp14="http://schemas.microsoft.com/office/word/2010/wordprocessingDrawing" xmlns:wp="http://schemas.openxmlformats.org/drawingml/2006/wordprocessingDrawing" xmlns:w10="urn:schemas-microsoft-com:office:word" xmlns:w="http://schemas.openxmlformats.org/wordprocessingml/2006/main" xmlns:w14="http://schemas.microsoft.com/office/word/2010/wordml" xmlns:w15="http://schemas.microsoft.com/office/word/2012/wordml" xmlns:w16cex="http://schemas.microsoft.com/office/word/2018/wordml/cex" xmlns:w16cid="http://schemas.microsoft.com/office/word/2016/wordml/cid" xmlns:w16="http://schemas.microsoft.com/office/word/2018/wordml" xmlns:w16sdtdh="http://schemas.microsoft.com/office/word/2020/wordml/sdtdatahash" xmlns:w16se="http://schemas.microsoft.com/office/word/2015/wordml/symex" xmlns:wpg="http://schemas.microsoft.com/office/word/2010/wordprocessingGroup" xmlns:wpi="http://schemas.microsoft.com/office/word/2010/wordprocessingInk" xmlns:wne="http://schemas.microsoft.com/office/word/2006/wordml" xmlns:wps="http://schemas.microsoft.com/office/word/2010/wordprocessingShape" mc:Ignorable="w14 w15 w16se w16cid w16 w16cex w16sdtdh wp14">
   <w:p>
     <w:pPr>
       <w:pStyle w:val="BodyText"/>
@@ -1499,7 +2554,7 @@
 </file>
 
 <file path=word/footer2.xml><?xml version="1.0" encoding="utf-8"?>
-<w:ftr xmlns:wpc="http://schemas.microsoft.com/office/word/2010/wordprocessingCanvas" xmlns:cx="http://schemas.microsoft.com/office/drawing/2014/chartex" xmlns:cx1="http://schemas.microsoft.com/office/drawing/2015/9/8/chartex" xmlns:cx2="http://schemas.microsoft.com/office/drawing/2015/10/21/chartex" xmlns:cx3="http://schemas.microsoft.com/office/drawing/2016/5/9/chartex" xmlns:cx4="http://schemas.microsoft.com/office/drawing/2016/5/10/chartex" xmlns:cx5="http://schemas.microsoft.com/office/drawing/2016/5/11/chartex" xmlns:cx6="http://schemas.microsoft.com/office/drawing/2016/5/12/chartex" xmlns:cx7="http://schemas.microsoft.com/office/drawing/2016/5/13/chartex" xmlns:cx8="http://schemas.microsoft.com/office/drawing/2016/5/14/chartex" xmlns:mc="http://schemas.openxmlformats.org/markup-compatibility/2006" xmlns:aink="http://schemas.microsoft.com/office/drawing/2016/ink" xmlns:am3d="http://schemas.microsoft.com/office/drawing/2017/model3d" xmlns:o="urn:schemas-microsoft-com:office:office" xmlns:oel="http://schemas.microsoft.com/office/2019/extlst" xmlns:r="http://schemas.openxmlformats.org/officeDocument/2006/relationships" xmlns:m="http://schemas.openxmlformats.org/officeDocument/2006/math" xmlns:v="urn:schemas-microsoft-com:vml" xmlns:wp14="http://schemas.microsoft.com/office/word/2010/wordprocessingDrawing" xmlns:wp="http://schemas.openxmlformats.org/drawingml/2006/wordprocessingDrawing" xmlns:w10="urn:schemas-microsoft-com:office:word" xmlns:w="http://schemas.openxmlformats.org/wordprocessingml/2006/main" xmlns:w14="http://schemas.microsoft.com/office/word/2010/wordml" xmlns:w15="http://schemas.microsoft.com/office/word/2012/wordml" xmlns:w16cex="http://schemas.microsoft.com/office/word/2018/wordml/cex" xmlns:w16cid="http://schemas.microsoft.com/office/word/2016/wordml/cid" xmlns:w16="http://schemas.microsoft.com/office/word/2018/wordml" xmlns:w16du="http://schemas.microsoft.com/office/word/2023/wordml/word16du" xmlns:w16sdtdh="http://schemas.microsoft.com/office/word/2020/wordml/sdtdatahash" xmlns:w16sdtfl="http://schemas.microsoft.com/office/word/2024/wordml/sdtformatlock" xmlns:w16se="http://schemas.microsoft.com/office/word/2015/wordml/symex" xmlns:wpg="http://schemas.microsoft.com/office/word/2010/wordprocessingGroup" xmlns:wpi="http://schemas.microsoft.com/office/word/2010/wordprocessingInk" xmlns:wne="http://schemas.microsoft.com/office/word/2006/wordml" xmlns:wps="http://schemas.microsoft.com/office/word/2010/wordprocessingShape" mc:Ignorable="w14 w15 w16se w16cid w16 w16cex w16sdtdh w16sdtfl w16du wp14">
+<w:ftr xmlns:wpc="http://schemas.microsoft.com/office/word/2010/wordprocessingCanvas" xmlns:cx="http://schemas.microsoft.com/office/drawing/2014/chartex" xmlns:cx1="http://schemas.microsoft.com/office/drawing/2015/9/8/chartex" xmlns:cx2="http://schemas.microsoft.com/office/drawing/2015/10/21/chartex" xmlns:cx3="http://schemas.microsoft.com/office/drawing/2016/5/9/chartex" xmlns:cx4="http://schemas.microsoft.com/office/drawing/2016/5/10/chartex" xmlns:cx5="http://schemas.microsoft.com/office/drawing/2016/5/11/chartex" xmlns:cx6="http://schemas.microsoft.com/office/drawing/2016/5/12/chartex" xmlns:cx7="http://schemas.microsoft.com/office/drawing/2016/5/13/chartex" xmlns:cx8="http://schemas.microsoft.com/office/drawing/2016/5/14/chartex" xmlns:mc="http://schemas.openxmlformats.org/markup-compatibility/2006" xmlns:aink="http://schemas.microsoft.com/office/drawing/2016/ink" xmlns:am3d="http://schemas.microsoft.com/office/drawing/2017/model3d" xmlns:o="urn:schemas-microsoft-com:office:office" xmlns:r="http://schemas.openxmlformats.org/officeDocument/2006/relationships" xmlns:m="http://schemas.openxmlformats.org/officeDocument/2006/math" xmlns:v="urn:schemas-microsoft-com:vml" xmlns:wp14="http://schemas.microsoft.com/office/word/2010/wordprocessingDrawing" xmlns:wp="http://schemas.openxmlformats.org/drawingml/2006/wordprocessingDrawing" xmlns:w10="urn:schemas-microsoft-com:office:word" xmlns:w="http://schemas.openxmlformats.org/wordprocessingml/2006/main" xmlns:w14="http://schemas.microsoft.com/office/word/2010/wordml" xmlns:w15="http://schemas.microsoft.com/office/word/2012/wordml" xmlns:w16cex="http://schemas.microsoft.com/office/word/2018/wordml/cex" xmlns:w16cid="http://schemas.microsoft.com/office/word/2016/wordml/cid" xmlns:w16="http://schemas.microsoft.com/office/word/2018/wordml" xmlns:w16sdtdh="http://schemas.microsoft.com/office/word/2020/wordml/sdtdatahash" xmlns:w16se="http://schemas.microsoft.com/office/word/2015/wordml/symex" xmlns:wpg="http://schemas.microsoft.com/office/word/2010/wordprocessingGroup" xmlns:wpi="http://schemas.microsoft.com/office/word/2010/wordprocessingInk" xmlns:wne="http://schemas.microsoft.com/office/word/2006/wordml" xmlns:wps="http://schemas.microsoft.com/office/word/2010/wordprocessingShape" mc:Ignorable="w14 w15 w16se w16cid w16 w16cex w16sdtdh wp14">
   <w:p>
     <w:pPr>
       <w:pStyle w:val="BodyText"/>
@@ -1513,7 +2568,7 @@
 </file>
 
 <file path=word/footnotes.xml><?xml version="1.0" encoding="utf-8"?>
-<w:footnotes xmlns:wpc="http://schemas.microsoft.com/office/word/2010/wordprocessingCanvas" xmlns:cx="http://schemas.microsoft.com/office/drawing/2014/chartex" xmlns:cx1="http://schemas.microsoft.com/office/drawing/2015/9/8/chartex" xmlns:cx2="http://schemas.microsoft.com/office/drawing/2015/10/21/chartex" xmlns:cx3="http://schemas.microsoft.com/office/drawing/2016/5/9/chartex" xmlns:cx4="http://schemas.microsoft.com/office/drawing/2016/5/10/chartex" xmlns:cx5="http://schemas.microsoft.com/office/drawing/2016/5/11/chartex" xmlns:cx6="http://schemas.microsoft.com/office/drawing/2016/5/12/chartex" xmlns:cx7="http://schemas.microsoft.com/office/drawing/2016/5/13/chartex" xmlns:cx8="http://schemas.microsoft.com/office/drawing/2016/5/14/chartex" xmlns:mc="http://schemas.openxmlformats.org/markup-compatibility/2006" xmlns:aink="http://schemas.microsoft.com/office/drawing/2016/ink" xmlns:am3d="http://schemas.microsoft.com/office/drawing/2017/model3d" xmlns:o="urn:schemas-microsoft-com:office:office" xmlns:oel="http://schemas.microsoft.com/office/2019/extlst" xmlns:r="http://schemas.openxmlformats.org/officeDocument/2006/relationships" xmlns:m="http://schemas.openxmlformats.org/officeDocument/2006/math" xmlns:v="urn:schemas-microsoft-com:vml" xmlns:wp14="http://schemas.microsoft.com/office/word/2010/wordprocessingDrawing" xmlns:wp="http://schemas.openxmlformats.org/drawingml/2006/wordprocessingDrawing" xmlns:w10="urn:schemas-microsoft-com:office:word" xmlns:w="http://schemas.openxmlformats.org/wordprocessingml/2006/main" xmlns:w14="http://schemas.microsoft.com/office/word/2010/wordml" xmlns:w15="http://schemas.microsoft.com/office/word/2012/wordml" xmlns:w16cex="http://schemas.microsoft.com/office/word/2018/wordml/cex" xmlns:w16cid="http://schemas.microsoft.com/office/word/2016/wordml/cid" xmlns:w16="http://schemas.microsoft.com/office/word/2018/wordml" xmlns:w16du="http://schemas.microsoft.com/office/word/2023/wordml/word16du" xmlns:w16sdtdh="http://schemas.microsoft.com/office/word/2020/wordml/sdtdatahash" xmlns:w16sdtfl="http://schemas.microsoft.com/office/word/2024/wordml/sdtformatlock" xmlns:w16se="http://schemas.microsoft.com/office/word/2015/wordml/symex" xmlns:wpg="http://schemas.microsoft.com/office/word/2010/wordprocessingGroup" xmlns:wpi="http://schemas.microsoft.com/office/word/2010/wordprocessingInk" xmlns:wne="http://schemas.microsoft.com/office/word/2006/wordml" xmlns:wps="http://schemas.microsoft.com/office/word/2010/wordprocessingShape" mc:Ignorable="w14 w15 w16se w16cid w16 w16cex w16sdtdh w16sdtfl w16du wp14">
+<w:footnotes xmlns:wpc="http://schemas.microsoft.com/office/word/2010/wordprocessingCanvas" xmlns:cx="http://schemas.microsoft.com/office/drawing/2014/chartex" xmlns:cx1="http://schemas.microsoft.com/office/drawing/2015/9/8/chartex" xmlns:cx2="http://schemas.microsoft.com/office/drawing/2015/10/21/chartex" xmlns:cx3="http://schemas.microsoft.com/office/drawing/2016/5/9/chartex" xmlns:cx4="http://schemas.microsoft.com/office/drawing/2016/5/10/chartex" xmlns:cx5="http://schemas.microsoft.com/office/drawing/2016/5/11/chartex" xmlns:cx6="http://schemas.microsoft.com/office/drawing/2016/5/12/chartex" xmlns:cx7="http://schemas.microsoft.com/office/drawing/2016/5/13/chartex" xmlns:cx8="http://schemas.microsoft.com/office/drawing/2016/5/14/chartex" xmlns:mc="http://schemas.openxmlformats.org/markup-compatibility/2006" xmlns:aink="http://schemas.microsoft.com/office/drawing/2016/ink" xmlns:am3d="http://schemas.microsoft.com/office/drawing/2017/model3d" xmlns:o="urn:schemas-microsoft-com:office:office" xmlns:r="http://schemas.openxmlformats.org/officeDocument/2006/relationships" xmlns:m="http://schemas.openxmlformats.org/officeDocument/2006/math" xmlns:v="urn:schemas-microsoft-com:vml" xmlns:wp14="http://schemas.microsoft.com/office/word/2010/wordprocessingDrawing" xmlns:wp="http://schemas.openxmlformats.org/drawingml/2006/wordprocessingDrawing" xmlns:w10="urn:schemas-microsoft-com:office:word" xmlns:w="http://schemas.openxmlformats.org/wordprocessingml/2006/main" xmlns:w14="http://schemas.microsoft.com/office/word/2010/wordml" xmlns:w15="http://schemas.microsoft.com/office/word/2012/wordml" xmlns:w16cex="http://schemas.microsoft.com/office/word/2018/wordml/cex" xmlns:w16cid="http://schemas.microsoft.com/office/word/2016/wordml/cid" xmlns:w16="http://schemas.microsoft.com/office/word/2018/wordml" xmlns:w16sdtdh="http://schemas.microsoft.com/office/word/2020/wordml/sdtdatahash" xmlns:w16se="http://schemas.microsoft.com/office/word/2015/wordml/symex" xmlns:wpg="http://schemas.microsoft.com/office/word/2010/wordprocessingGroup" xmlns:wpi="http://schemas.microsoft.com/office/word/2010/wordprocessingInk" xmlns:wne="http://schemas.microsoft.com/office/word/2006/wordml" xmlns:wps="http://schemas.microsoft.com/office/word/2010/wordprocessingShape" mc:Ignorable="w14 w15 w16se w16cid w16 w16cex w16sdtdh wp14">
   <w:footnote w:type="separator" w:id="-1">
     <w:p>
       <w:r>
@@ -1532,7 +2587,7 @@
 </file>
 
 <file path=word/header1.xml><?xml version="1.0" encoding="utf-8"?>
-<w:hdr xmlns:wpc="http://schemas.microsoft.com/office/word/2010/wordprocessingCanvas" xmlns:cx="http://schemas.microsoft.com/office/drawing/2014/chartex" xmlns:cx1="http://schemas.microsoft.com/office/drawing/2015/9/8/chartex" xmlns:cx2="http://schemas.microsoft.com/office/drawing/2015/10/21/chartex" xmlns:cx3="http://schemas.microsoft.com/office/drawing/2016/5/9/chartex" xmlns:cx4="http://schemas.microsoft.com/office/drawing/2016/5/10/chartex" xmlns:cx5="http://schemas.microsoft.com/office/drawing/2016/5/11/chartex" xmlns:cx6="http://schemas.microsoft.com/office/drawing/2016/5/12/chartex" xmlns:cx7="http://schemas.microsoft.com/office/drawing/2016/5/13/chartex" xmlns:cx8="http://schemas.microsoft.com/office/drawing/2016/5/14/chartex" xmlns:mc="http://schemas.openxmlformats.org/markup-compatibility/2006" xmlns:aink="http://schemas.microsoft.com/office/drawing/2016/ink" xmlns:am3d="http://schemas.microsoft.com/office/drawing/2017/model3d" xmlns:o="urn:schemas-microsoft-com:office:office" xmlns:oel="http://schemas.microsoft.com/office/2019/extlst" xmlns:r="http://schemas.openxmlformats.org/officeDocument/2006/relationships" xmlns:m="http://schemas.openxmlformats.org/officeDocument/2006/math" xmlns:v="urn:schemas-microsoft-com:vml" xmlns:wp14="http://schemas.microsoft.com/office/word/2010/wordprocessingDrawing" xmlns:wp="http://schemas.openxmlformats.org/drawingml/2006/wordprocessingDrawing" xmlns:w10="urn:schemas-microsoft-com:office:word" xmlns:w="http://schemas.openxmlformats.org/wordprocessingml/2006/main" xmlns:w14="http://schemas.microsoft.com/office/word/2010/wordml" xmlns:w15="http://schemas.microsoft.com/office/word/2012/wordml" xmlns:w16cex="http://schemas.microsoft.com/office/word/2018/wordml/cex" xmlns:w16cid="http://schemas.microsoft.com/office/word/2016/wordml/cid" xmlns:w16="http://schemas.microsoft.com/office/word/2018/wordml" xmlns:w16du="http://schemas.microsoft.com/office/word/2023/wordml/word16du" xmlns:w16sdtdh="http://schemas.microsoft.com/office/word/2020/wordml/sdtdatahash" xmlns:w16sdtfl="http://schemas.microsoft.com/office/word/2024/wordml/sdtformatlock" xmlns:w16se="http://schemas.microsoft.com/office/word/2015/wordml/symex" xmlns:wpg="http://schemas.microsoft.com/office/word/2010/wordprocessingGroup" xmlns:wpi="http://schemas.microsoft.com/office/word/2010/wordprocessingInk" xmlns:wne="http://schemas.microsoft.com/office/word/2006/wordml" xmlns:wps="http://schemas.microsoft.com/office/word/2010/wordprocessingShape" mc:Ignorable="w14 w15 w16se w16cid w16 w16cex w16sdtdh w16sdtfl w16du wp14">
+<w:hdr xmlns:wpc="http://schemas.microsoft.com/office/word/2010/wordprocessingCanvas" xmlns:cx="http://schemas.microsoft.com/office/drawing/2014/chartex" xmlns:cx1="http://schemas.microsoft.com/office/drawing/2015/9/8/chartex" xmlns:cx2="http://schemas.microsoft.com/office/drawing/2015/10/21/chartex" xmlns:cx3="http://schemas.microsoft.com/office/drawing/2016/5/9/chartex" xmlns:cx4="http://schemas.microsoft.com/office/drawing/2016/5/10/chartex" xmlns:cx5="http://schemas.microsoft.com/office/drawing/2016/5/11/chartex" xmlns:cx6="http://schemas.microsoft.com/office/drawing/2016/5/12/chartex" xmlns:cx7="http://schemas.microsoft.com/office/drawing/2016/5/13/chartex" xmlns:cx8="http://schemas.microsoft.com/office/drawing/2016/5/14/chartex" xmlns:mc="http://schemas.openxmlformats.org/markup-compatibility/2006" xmlns:aink="http://schemas.microsoft.com/office/drawing/2016/ink" xmlns:am3d="http://schemas.microsoft.com/office/drawing/2017/model3d" xmlns:o="urn:schemas-microsoft-com:office:office" xmlns:r="http://schemas.openxmlformats.org/officeDocument/2006/relationships" xmlns:m="http://schemas.openxmlformats.org/officeDocument/2006/math" xmlns:v="urn:schemas-microsoft-com:vml" xmlns:wp14="http://schemas.microsoft.com/office/word/2010/wordprocessingDrawing" xmlns:wp="http://schemas.openxmlformats.org/drawingml/2006/wordprocessingDrawing" xmlns:w10="urn:schemas-microsoft-com:office:word" xmlns:w="http://schemas.openxmlformats.org/wordprocessingml/2006/main" xmlns:w14="http://schemas.microsoft.com/office/word/2010/wordml" xmlns:w15="http://schemas.microsoft.com/office/word/2012/wordml" xmlns:w16cex="http://schemas.microsoft.com/office/word/2018/wordml/cex" xmlns:w16cid="http://schemas.microsoft.com/office/word/2016/wordml/cid" xmlns:w16="http://schemas.microsoft.com/office/word/2018/wordml" xmlns:w16sdtdh="http://schemas.microsoft.com/office/word/2020/wordml/sdtdatahash" xmlns:w16se="http://schemas.microsoft.com/office/word/2015/wordml/symex" xmlns:wpg="http://schemas.microsoft.com/office/word/2010/wordprocessingGroup" xmlns:wpi="http://schemas.microsoft.com/office/word/2010/wordprocessingInk" xmlns:wne="http://schemas.microsoft.com/office/word/2006/wordml" xmlns:wps="http://schemas.microsoft.com/office/word/2010/wordprocessingShape" mc:Ignorable="w14 w15 w16se w16cid w16 w16cex w16sdtdh wp14">
   <w:p>
     <w:pPr>
       <w:pStyle w:val="Header"/>
@@ -1958,7 +3013,7 @@
 </file>
 
 <file path=word/header2.xml><?xml version="1.0" encoding="utf-8"?>
-<w:hdr xmlns:wpc="http://schemas.microsoft.com/office/word/2010/wordprocessingCanvas" xmlns:cx="http://schemas.microsoft.com/office/drawing/2014/chartex" xmlns:cx1="http://schemas.microsoft.com/office/drawing/2015/9/8/chartex" xmlns:cx2="http://schemas.microsoft.com/office/drawing/2015/10/21/chartex" xmlns:cx3="http://schemas.microsoft.com/office/drawing/2016/5/9/chartex" xmlns:cx4="http://schemas.microsoft.com/office/drawing/2016/5/10/chartex" xmlns:cx5="http://schemas.microsoft.com/office/drawing/2016/5/11/chartex" xmlns:cx6="http://schemas.microsoft.com/office/drawing/2016/5/12/chartex" xmlns:cx7="http://schemas.microsoft.com/office/drawing/2016/5/13/chartex" xmlns:cx8="http://schemas.microsoft.com/office/drawing/2016/5/14/chartex" xmlns:mc="http://schemas.openxmlformats.org/markup-compatibility/2006" xmlns:aink="http://schemas.microsoft.com/office/drawing/2016/ink" xmlns:am3d="http://schemas.microsoft.com/office/drawing/2017/model3d" xmlns:o="urn:schemas-microsoft-com:office:office" xmlns:oel="http://schemas.microsoft.com/office/2019/extlst" xmlns:r="http://schemas.openxmlformats.org/officeDocument/2006/relationships" xmlns:m="http://schemas.openxmlformats.org/officeDocument/2006/math" xmlns:v="urn:schemas-microsoft-com:vml" xmlns:wp14="http://schemas.microsoft.com/office/word/2010/wordprocessingDrawing" xmlns:wp="http://schemas.openxmlformats.org/drawingml/2006/wordprocessingDrawing" xmlns:w10="urn:schemas-microsoft-com:office:word" xmlns:w="http://schemas.openxmlformats.org/wordprocessingml/2006/main" xmlns:w14="http://schemas.microsoft.com/office/word/2010/wordml" xmlns:w15="http://schemas.microsoft.com/office/word/2012/wordml" xmlns:w16cex="http://schemas.microsoft.com/office/word/2018/wordml/cex" xmlns:w16cid="http://schemas.microsoft.com/office/word/2016/wordml/cid" xmlns:w16="http://schemas.microsoft.com/office/word/2018/wordml" xmlns:w16du="http://schemas.microsoft.com/office/word/2023/wordml/word16du" xmlns:w16sdtdh="http://schemas.microsoft.com/office/word/2020/wordml/sdtdatahash" xmlns:w16sdtfl="http://schemas.microsoft.com/office/word/2024/wordml/sdtformatlock" xmlns:w16se="http://schemas.microsoft.com/office/word/2015/wordml/symex" xmlns:wpg="http://schemas.microsoft.com/office/word/2010/wordprocessingGroup" xmlns:wpi="http://schemas.microsoft.com/office/word/2010/wordprocessingInk" xmlns:wne="http://schemas.microsoft.com/office/word/2006/wordml" xmlns:wps="http://schemas.microsoft.com/office/word/2010/wordprocessingShape" mc:Ignorable="w14 w15 w16se w16cid w16 w16cex w16sdtdh w16sdtfl w16du wp14">
+<w:hdr xmlns:wpc="http://schemas.microsoft.com/office/word/2010/wordprocessingCanvas" xmlns:cx="http://schemas.microsoft.com/office/drawing/2014/chartex" xmlns:cx1="http://schemas.microsoft.com/office/drawing/2015/9/8/chartex" xmlns:cx2="http://schemas.microsoft.com/office/drawing/2015/10/21/chartex" xmlns:cx3="http://schemas.microsoft.com/office/drawing/2016/5/9/chartex" xmlns:cx4="http://schemas.microsoft.com/office/drawing/2016/5/10/chartex" xmlns:cx5="http://schemas.microsoft.com/office/drawing/2016/5/11/chartex" xmlns:cx6="http://schemas.microsoft.com/office/drawing/2016/5/12/chartex" xmlns:cx7="http://schemas.microsoft.com/office/drawing/2016/5/13/chartex" xmlns:cx8="http://schemas.microsoft.com/office/drawing/2016/5/14/chartex" xmlns:mc="http://schemas.openxmlformats.org/markup-compatibility/2006" xmlns:aink="http://schemas.microsoft.com/office/drawing/2016/ink" xmlns:am3d="http://schemas.microsoft.com/office/drawing/2017/model3d" xmlns:o="urn:schemas-microsoft-com:office:office" xmlns:r="http://schemas.openxmlformats.org/officeDocument/2006/relationships" xmlns:m="http://schemas.openxmlformats.org/officeDocument/2006/math" xmlns:v="urn:schemas-microsoft-com:vml" xmlns:wp14="http://schemas.microsoft.com/office/word/2010/wordprocessingDrawing" xmlns:wp="http://schemas.openxmlformats.org/drawingml/2006/wordprocessingDrawing" xmlns:w10="urn:schemas-microsoft-com:office:word" xmlns:w="http://schemas.openxmlformats.org/wordprocessingml/2006/main" xmlns:w14="http://schemas.microsoft.com/office/word/2010/wordml" xmlns:w15="http://schemas.microsoft.com/office/word/2012/wordml" xmlns:w16cex="http://schemas.microsoft.com/office/word/2018/wordml/cex" xmlns:w16cid="http://schemas.microsoft.com/office/word/2016/wordml/cid" xmlns:w16="http://schemas.microsoft.com/office/word/2018/wordml" xmlns:w16sdtdh="http://schemas.microsoft.com/office/word/2020/wordml/sdtdatahash" xmlns:w16se="http://schemas.microsoft.com/office/word/2015/wordml/symex" xmlns:wpg="http://schemas.microsoft.com/office/word/2010/wordprocessingGroup" xmlns:wpi="http://schemas.microsoft.com/office/word/2010/wordprocessingInk" xmlns:wne="http://schemas.microsoft.com/office/word/2006/wordml" xmlns:wps="http://schemas.microsoft.com/office/word/2010/wordprocessingShape" mc:Ignorable="w14 w15 w16se w16cid w16 w16cex w16sdtdh wp14">
   <w:p>
     <w:pPr>
       <w:pStyle w:val="Header"/>
@@ -1968,7 +3023,7 @@
 </file>
 
 <file path=word/numbering.xml><?xml version="1.0" encoding="utf-8"?>
-<w:numbering xmlns:wpc="http://schemas.microsoft.com/office/word/2010/wordprocessingCanvas" xmlns:cx="http://schemas.microsoft.com/office/drawing/2014/chartex" xmlns:cx1="http://schemas.microsoft.com/office/drawing/2015/9/8/chartex" xmlns:cx2="http://schemas.microsoft.com/office/drawing/2015/10/21/chartex" xmlns:cx3="http://schemas.microsoft.com/office/drawing/2016/5/9/chartex" xmlns:cx4="http://schemas.microsoft.com/office/drawing/2016/5/10/chartex" xmlns:cx5="http://schemas.microsoft.com/office/drawing/2016/5/11/chartex" xmlns:cx6="http://schemas.microsoft.com/office/drawing/2016/5/12/chartex" xmlns:cx7="http://schemas.microsoft.com/office/drawing/2016/5/13/chartex" xmlns:cx8="http://schemas.microsoft.com/office/drawing/2016/5/14/chartex" xmlns:mc="http://schemas.openxmlformats.org/markup-compatibility/2006" xmlns:aink="http://schemas.microsoft.com/office/drawing/2016/ink" xmlns:am3d="http://schemas.microsoft.com/office/drawing/2017/model3d" xmlns:o="urn:schemas-microsoft-com:office:office" xmlns:oel="http://schemas.microsoft.com/office/2019/extlst" xmlns:r="http://schemas.openxmlformats.org/officeDocument/2006/relationships" xmlns:m="http://schemas.openxmlformats.org/officeDocument/2006/math" xmlns:v="urn:schemas-microsoft-com:vml" xmlns:wp14="http://schemas.microsoft.com/office/word/2010/wordprocessingDrawing" xmlns:wp="http://schemas.openxmlformats.org/drawingml/2006/wordprocessingDrawing" xmlns:w10="urn:schemas-microsoft-com:office:word" xmlns:w="http://schemas.openxmlformats.org/wordprocessingml/2006/main" xmlns:w14="http://schemas.microsoft.com/office/word/2010/wordml" xmlns:w15="http://schemas.microsoft.com/office/word/2012/wordml" xmlns:w16cex="http://schemas.microsoft.com/office/word/2018/wordml/cex" xmlns:w16cid="http://schemas.microsoft.com/office/word/2016/wordml/cid" xmlns:w16="http://schemas.microsoft.com/office/word/2018/wordml" xmlns:w16du="http://schemas.microsoft.com/office/word/2023/wordml/word16du" xmlns:w16sdtdh="http://schemas.microsoft.com/office/word/2020/wordml/sdtdatahash" xmlns:w16sdtfl="http://schemas.microsoft.com/office/word/2024/wordml/sdtformatlock" xmlns:w16se="http://schemas.microsoft.com/office/word/2015/wordml/symex" xmlns:wpg="http://schemas.microsoft.com/office/word/2010/wordprocessingGroup" xmlns:wpi="http://schemas.microsoft.com/office/word/2010/wordprocessingInk" xmlns:wne="http://schemas.microsoft.com/office/word/2006/wordml" xmlns:wps="http://schemas.microsoft.com/office/word/2010/wordprocessingShape" mc:Ignorable="w14 w15 w16se w16cid w16 w16cex w16sdtdh w16sdtfl w16du wp14">
+<w:numbering xmlns:wpc="http://schemas.microsoft.com/office/word/2010/wordprocessingCanvas" xmlns:cx="http://schemas.microsoft.com/office/drawing/2014/chartex" xmlns:cx1="http://schemas.microsoft.com/office/drawing/2015/9/8/chartex" xmlns:cx2="http://schemas.microsoft.com/office/drawing/2015/10/21/chartex" xmlns:cx3="http://schemas.microsoft.com/office/drawing/2016/5/9/chartex" xmlns:cx4="http://schemas.microsoft.com/office/drawing/2016/5/10/chartex" xmlns:cx5="http://schemas.microsoft.com/office/drawing/2016/5/11/chartex" xmlns:cx6="http://schemas.microsoft.com/office/drawing/2016/5/12/chartex" xmlns:cx7="http://schemas.microsoft.com/office/drawing/2016/5/13/chartex" xmlns:cx8="http://schemas.microsoft.com/office/drawing/2016/5/14/chartex" xmlns:mc="http://schemas.openxmlformats.org/markup-compatibility/2006" xmlns:aink="http://schemas.microsoft.com/office/drawing/2016/ink" xmlns:am3d="http://schemas.microsoft.com/office/drawing/2017/model3d" xmlns:o="urn:schemas-microsoft-com:office:office" xmlns:r="http://schemas.openxmlformats.org/officeDocument/2006/relationships" xmlns:m="http://schemas.openxmlformats.org/officeDocument/2006/math" xmlns:v="urn:schemas-microsoft-com:vml" xmlns:wp14="http://schemas.microsoft.com/office/word/2010/wordprocessingDrawing" xmlns:wp="http://schemas.openxmlformats.org/drawingml/2006/wordprocessingDrawing" xmlns:w10="urn:schemas-microsoft-com:office:word" xmlns:w="http://schemas.openxmlformats.org/wordprocessingml/2006/main" xmlns:w14="http://schemas.microsoft.com/office/word/2010/wordml" xmlns:w15="http://schemas.microsoft.com/office/word/2012/wordml" xmlns:w16cex="http://schemas.microsoft.com/office/word/2018/wordml/cex" xmlns:w16cid="http://schemas.microsoft.com/office/word/2016/wordml/cid" xmlns:w16="http://schemas.microsoft.com/office/word/2018/wordml" xmlns:w16sdtdh="http://schemas.microsoft.com/office/word/2020/wordml/sdtdatahash" xmlns:w16se="http://schemas.microsoft.com/office/word/2015/wordml/symex" xmlns:wpg="http://schemas.microsoft.com/office/word/2010/wordprocessingGroup" xmlns:wpi="http://schemas.microsoft.com/office/word/2010/wordprocessingInk" xmlns:wne="http://schemas.microsoft.com/office/word/2006/wordml" xmlns:wps="http://schemas.microsoft.com/office/word/2010/wordprocessingShape" mc:Ignorable="w14 w15 w16se w16cid w16 w16cex w16sdtdh wp14">
   <w:abstractNum w:abstractNumId="0" w15:restartNumberingAfterBreak="0">
     <w:nsid w:val="1557717B"/>
     <w:multiLevelType w:val="hybridMultilevel"/>
@@ -2640,22 +3695,22 @@
       </w:pPr>
     </w:lvl>
   </w:abstractNum>
-  <w:num w:numId="1" w16cid:durableId="1618373765">
+  <w:num w:numId="1">
     <w:abstractNumId w:val="2"/>
   </w:num>
-  <w:num w:numId="2" w16cid:durableId="2023971741">
+  <w:num w:numId="2">
     <w:abstractNumId w:val="0"/>
   </w:num>
-  <w:num w:numId="3" w16cid:durableId="20055454">
+  <w:num w:numId="3">
     <w:abstractNumId w:val="4"/>
   </w:num>
-  <w:num w:numId="4" w16cid:durableId="1075326230">
+  <w:num w:numId="4">
     <w:abstractNumId w:val="3"/>
   </w:num>
-  <w:num w:numId="5" w16cid:durableId="1556432477">
+  <w:num w:numId="5">
     <w:abstractNumId w:val="1"/>
   </w:num>
-  <w:num w:numId="6" w16cid:durableId="1821146090">
+  <w:num w:numId="6">
     <w:abstractNumId w:val="5"/>
     <w:lvlOverride w:ilvl="0">
       <w:startOverride w:val="1"/>
@@ -2689,7 +3744,7 @@
 </file>
 
 <file path=word/styles.xml><?xml version="1.0" encoding="utf-8"?>
-<w:styles xmlns:mc="http://schemas.openxmlformats.org/markup-compatibility/2006" xmlns:r="http://schemas.openxmlformats.org/officeDocument/2006/relationships" xmlns:w="http://schemas.openxmlformats.org/wordprocessingml/2006/main" xmlns:w14="http://schemas.microsoft.com/office/word/2010/wordml" xmlns:w15="http://schemas.microsoft.com/office/word/2012/wordml" xmlns:w16cex="http://schemas.microsoft.com/office/word/2018/wordml/cex" xmlns:w16cid="http://schemas.microsoft.com/office/word/2016/wordml/cid" xmlns:w16="http://schemas.microsoft.com/office/word/2018/wordml" xmlns:w16du="http://schemas.microsoft.com/office/word/2023/wordml/word16du" xmlns:w16sdtdh="http://schemas.microsoft.com/office/word/2020/wordml/sdtdatahash" xmlns:w16sdtfl="http://schemas.microsoft.com/office/word/2024/wordml/sdtformatlock" xmlns:w16se="http://schemas.microsoft.com/office/word/2015/wordml/symex" mc:Ignorable="w14 w15 w16se w16cid w16 w16cex w16sdtdh w16sdtfl w16du">
+<w:styles xmlns:mc="http://schemas.openxmlformats.org/markup-compatibility/2006" xmlns:r="http://schemas.openxmlformats.org/officeDocument/2006/relationships" xmlns:w="http://schemas.openxmlformats.org/wordprocessingml/2006/main" xmlns:w14="http://schemas.microsoft.com/office/word/2010/wordml" xmlns:w15="http://schemas.microsoft.com/office/word/2012/wordml" xmlns:w16cex="http://schemas.microsoft.com/office/word/2018/wordml/cex" xmlns:w16cid="http://schemas.microsoft.com/office/word/2016/wordml/cid" xmlns:w16="http://schemas.microsoft.com/office/word/2018/wordml" xmlns:w16sdtdh="http://schemas.microsoft.com/office/word/2020/wordml/sdtdatahash" xmlns:w16se="http://schemas.microsoft.com/office/word/2015/wordml/symex" mc:Ignorable="w14 w15 w16se w16cid w16 w16cex w16sdtdh">
   <w:docDefaults>
     <w:rPrDefault>
       <w:rPr>

</xml_diff>

<commit_message>
feat: add date formatting methods and update templates for BAST and SPK
</commit_message>
<xml_diff>
--- a/servers/apps/surveyact/templates/bast-spk/template-bast.docx
+++ b/servers/apps/surveyact/templates/bast-spk/template-bast.docx
@@ -110,6 +110,13 @@
           <w:lang w:val="en-US"/>
         </w:rPr>
         <w:t>{bulan</w:t>
+      </w:r>
+      <w:r>
+        <w:rPr>
+          <w:rFonts w:asciiTheme="minorHAnsi" w:hAnsiTheme="minorHAnsi" w:cstheme="minorHAnsi"/>
+          <w:lang w:val="en-US"/>
+        </w:rPr>
+        <w:t>Periode</w:t>
       </w:r>
       <w:r>
         <w:rPr>
@@ -970,7 +977,21 @@
           <w:rFonts w:asciiTheme="minorHAnsi" w:hAnsiTheme="minorHAnsi" w:cstheme="minorHAnsi"/>
           <w:lang w:val="en-US"/>
         </w:rPr>
-        <w:t>{bulan}</w:t>
+        <w:t>{</w:t>
+      </w:r>
+      <w:r>
+        <w:rPr>
+          <w:rFonts w:asciiTheme="minorHAnsi" w:hAnsiTheme="minorHAnsi" w:cstheme="minorHAnsi"/>
+          <w:lang w:val="en-US"/>
+        </w:rPr>
+        <w:t>bulanPeriode</w:t>
+      </w:r>
+      <w:r>
+        <w:rPr>
+          <w:rFonts w:asciiTheme="minorHAnsi" w:hAnsiTheme="minorHAnsi" w:cstheme="minorHAnsi"/>
+          <w:lang w:val="en-US"/>
+        </w:rPr>
+        <w:t>}</w:t>
       </w:r>
       <w:r>
         <w:rPr>

</xml_diff>